<commit_message>
SOW V2 revision 2: user answers Q1-Q8, EQ jobs, ZMMS daily jobs, spare-part condition
Co-Authored-By: Claude Opus 5.5 <noreply@anthropic.com>
</commit_message>
<xml_diff>
--- a/docs/SOW_V2.docx
+++ b/docs/SOW_V2.docx
@@ -15,7 +15,7 @@
     </w:p>
     <w:p>
       <w:r>
-        <w:t>Version 2.0 DRAFT | 22 October 2026 | For user confirmation</w:t>
+        <w:t>Version 2.0 DRAFT, revision 2 | 22 October 2026 | For user confirmation</w:t>
       </w:r>
     </w:p>
     <w:p>
@@ -30,6 +30,11 @@
       </w:r>
       <w:r>
         <w:t>) only on the points below. Everything in V1, in the approved requirements v1.1 and in the confirmed U1 changes (U1-C01 to U1-C16) stays valid for the EQ section unless this document says otherwise. The prompt pack is not changed until you confirm this SOW.</w:t>
+      </w:r>
+    </w:p>
+    <w:p>
+      <w:r>
+        <w:t>Revision 2 records your answers to Q1-Q8 (section 9) and adds the EQ Jobs tab changes: special jobs, daily jobs read from ZMMS, automatic EQ status and the spare-part condition register (section 4).</w:t>
       </w:r>
     </w:p>
     <w:p>
@@ -141,7 +146,7 @@
         <w:pStyle w:val="ListBullet"/>
       </w:pPr>
       <w:r>
-        <w:t>EQ section: no functional change in V2.</w:t>
+        <w:t>EQ section: the Jobs tab has three parts - special jobs (manual, bound to a mechanism or part) with the daily maintenance jobs read from ZMMS listed below them, EQ status (automatic from ZMMS, with manual correction) and the condition of major spare parts. The crane view shows the current state only; work history is kept in the Jobs tab.</w:t>
       </w:r>
     </w:p>
     <w:p>
@@ -164,6 +169,8 @@
         <w:t>+-- ENG Portal &gt; EQ &amp; FAC Maintenance ---------------- [  EQ  |  FAC  ] --- user v --+</w:t>
         <w:br/>
         <w:t>|  EQ   :  Fleet  |  Jobs                     (equipment detail opens from Fleet)    |</w:t>
+        <w:br/>
+        <w:t>|          Jobs = Special &amp; daily jobs | EQ status | Spare parts condition           |</w:t>
         <w:br/>
         <w:t>|  FAC  :  FAC Dashboard  |  FAC Jobs         (job detail opens from either tab)     |</w:t>
         <w:br/>
@@ -463,7 +470,7 @@
               <w:rPr>
                 <w:sz w:val="19"/>
               </w:rPr>
-              <w:t>Works on EQ (jobs, operational status, replacements); can read FAC</w:t>
+              <w:t>Works on EQ (special jobs, status correction, spare-part condition); can read FAC</w:t>
             </w:r>
           </w:p>
         </w:tc>
@@ -815,7 +822,7 @@
               <w:rPr>
                 <w:sz w:val="19"/>
               </w:rPr>
-              <w:t>EQ work: jobs, status, replacements</w:t>
+              <w:t>EQ work: special jobs, status correction, spare-part condition</w:t>
             </w:r>
           </w:p>
         </w:tc>
@@ -1432,14 +1439,532 @@
         <w:rPr>
           <w:color w:val="1F3A5F"/>
         </w:rPr>
-        <w:t>4 EQ section (no change)</w:t>
+        <w:t>4 EQ section</w:t>
       </w:r>
     </w:p>
     <w:p>
       <w:r>
-        <w:t>As V1, approved requirements v1.1 and the U1 changes: Fleet tab with Ready for OPS / Breakdown / Maintenance / Unreported, equipment detail with the QC 3D and flat views and tier 1 &gt; 2 &gt; 3 drill-down, Jobs tab with Pending / Current / Completed work, replacement history and Admin catalogue. The U1 walkthrough of the EQ prototype is still open (see section 8).</w:t>
+        <w:t>The Fleet tab, the equipment (crane) view with the QC 3D and flat views, the tier 1 &gt; 2 &gt; 3 drill-down and the Admin catalogue stay as in V1, the approved requirements v1.1 and the U1 changes, except for the points below.</w:t>
       </w:r>
     </w:p>
+    <w:p>
+      <w:pPr>
+        <w:pStyle w:val="Heading2"/>
+      </w:pPr>
+      <w:r>
+        <w:rPr>
+          <w:color w:val="1F3A5F"/>
+        </w:rPr>
+        <w:t>4.1 Crane view: current state only</w:t>
+      </w:r>
+    </w:p>
+    <w:p>
+      <w:pPr>
+        <w:pStyle w:val="ListBullet"/>
+      </w:pPr>
+      <w:r>
+        <w:t>Selecting a mechanism or part shows its current state in the right panel: open special jobs, current spare-part condition (Original/Replaced, brand, replaced date, next predicted replacement) and specifications.</w:t>
+      </w:r>
+    </w:p>
+    <w:p>
+      <w:pPr>
+        <w:pStyle w:val="ListBullet"/>
+      </w:pPr>
+      <w:r>
+        <w:t>No work history is shown in the crane view. An "Open in Jobs" link opens the Jobs tab filtered to that equipment and selection, where the full history is kept.</w:t>
+      </w:r>
+    </w:p>
+    <w:p>
+      <w:pPr>
+        <w:pStyle w:val="ListBullet"/>
+      </w:pPr>
+      <w:r>
+        <w:t>Fleet cards show whether the status is automatic (ZMMS) or a manual correction, and the number of today's ZMMS daily jobs.</w:t>
+      </w:r>
+    </w:p>
+    <w:p>
+      <w:pPr>
+        <w:pStyle w:val="Heading2"/>
+      </w:pPr>
+      <w:r>
+        <w:rPr>
+          <w:color w:val="1F3A5F"/>
+        </w:rPr>
+        <w:t>4.2 EQ Jobs tab - three parts</w:t>
+      </w:r>
+    </w:p>
+    <w:p>
+      <w:r>
+        <w:rPr>
+          <w:rFonts w:ascii="Consolas" w:hAnsi="Consolas"/>
+          <w:sz w:val="13"/>
+        </w:rPr>
+        <w:t>EQ Jobs:  [ Special &amp; daily jobs ]   [ EQ status ]   [ Spare parts condition ]</w:t>
+        <w:br/>
+        <w:t xml:space="preserve">          +-- Special jobs (manual, per mechanism / sub-mechanism / part) ----+</w:t>
+        <w:br/>
+        <w:t xml:space="preserve">          |  ...                                                              |</w:t>
+        <w:br/>
+        <w:t xml:space="preserve">          +-- Daily maintenance jobs (from ZMMS, read-only) -----------------+</w:t>
+        <w:br/>
+        <w:t xml:space="preserve">          |  ...                                                              |</w:t>
+        <w:br/>
+        <w:t xml:space="preserve">          +-------------------------------------------------------------------+</w:t>
+      </w:r>
+    </w:p>
+    <w:p>
+      <w:r>
+        <w:t>All three parts share the filters equipment, type (QC/RTG/ES), date range and search, and keep their full history.</w:t>
+      </w:r>
+    </w:p>
+    <w:p>
+      <w:pPr>
+        <w:pStyle w:val="Heading2"/>
+      </w:pPr>
+      <w:r>
+        <w:rPr>
+          <w:color w:val="1F3A5F"/>
+        </w:rPr>
+        <w:t>4.3 Special jobs (manual)</w:t>
+      </w:r>
+    </w:p>
+    <w:p>
+      <w:pPr>
+        <w:pStyle w:val="ListBullet"/>
+      </w:pPr>
+      <w:r>
+        <w:t>Major or non-routine work entered and updated manually by the EQ Team. Each special job is bound to one equipment and to its main mechanism, sub-mechanism or main part (as the V1 job record).</w:t>
+      </w:r>
+    </w:p>
+    <w:p>
+      <w:pPr>
+        <w:pStyle w:val="ListBullet"/>
+      </w:pPr>
+      <w:r>
+        <w:t>Fields as V1: title, Repair or Replacement, description, planned date, responsible person (optional), status Pending / Current / Completed, completion date and note, optional photos. Cancellation and Admin correction rules as V1.</w:t>
+      </w:r>
+    </w:p>
+    <w:p>
+      <w:pPr>
+        <w:pStyle w:val="ListBullet"/>
+      </w:pPr>
+      <w:r>
+        <w:t>Completing a Replacement special job opens the spare-part condition form for the selected part, pre-filled (4.6).</w:t>
+      </w:r>
+    </w:p>
+    <w:p>
+      <w:pPr>
+        <w:pStyle w:val="ListBullet"/>
+      </w:pPr>
+      <w:r>
+        <w:t>The list shows open jobs first; completed and cancelled jobs remain as history in this tab.</w:t>
+      </w:r>
+    </w:p>
+    <w:p>
+      <w:pPr>
+        <w:pStyle w:val="Heading2"/>
+      </w:pPr>
+      <w:r>
+        <w:rPr>
+          <w:color w:val="1F3A5F"/>
+        </w:rPr>
+        <w:t>4.4 Daily maintenance jobs (from ZMMS)</w:t>
+      </w:r>
+    </w:p>
+    <w:p>
+      <w:pPr>
+        <w:pStyle w:val="ListBullet"/>
+      </w:pPr>
+      <w:r>
+        <w:t xml:space="preserve">Source: the ZMMS (CMMS.LK) daily all-job list, </w:t>
+      </w:r>
+      <w:r>
+        <w:rPr>
+          <w:rFonts w:ascii="Consolas" w:hAnsi="Consolas"/>
+        </w:rPr>
+        <w:t>https://www.zmms.lk/?r=job/daily-alljob</w:t>
+      </w:r>
+      <w:r>
+        <w:t>. The page needs a login (checked 22 October 2026); you provide a separate account for this.</w:t>
+      </w:r>
+    </w:p>
+    <w:p>
+      <w:pPr>
+        <w:pStyle w:val="ListBullet"/>
+      </w:pPr>
+      <w:r>
+        <w:t>The app server reads the list automatically once a day (default 06:00 Asia/Colombo; Admin can change the time and press "Sync now"). Reading only - the app never writes to ZMMS.</w:t>
+      </w:r>
+    </w:p>
+    <w:p>
+      <w:pPr>
+        <w:pStyle w:val="ListBullet"/>
+      </w:pPr>
+      <w:r>
+        <w:t>Each record keeps what ZMMS gives, at least: ZMMS job number, date, equipment, job description or type and job status. The exact field list is fixed once the account is available.</w:t>
+      </w:r>
+    </w:p>
+    <w:p>
+      <w:pPr>
+        <w:pStyle w:val="ListBullet"/>
+      </w:pPr>
+      <w:r>
+        <w:t>ZMMS equipment names or codes are matched to app equipment through a mapping table in Admin. Rows that do not match are listed in Admin for mapping and are not lost.</w:t>
+      </w:r>
+    </w:p>
+    <w:p>
+      <w:pPr>
+        <w:pStyle w:val="ListBullet"/>
+      </w:pPr>
+      <w:r>
+        <w:t>The daily jobs are listed in the Jobs tab below the special jobs, read-only, with the same filters. Every synced day is kept, so the Jobs tab holds the daily-job history. They are linked to the equipment only, not to a mechanism or part.</w:t>
+      </w:r>
+    </w:p>
+    <w:p>
+      <w:pPr>
+        <w:pStyle w:val="ListBullet"/>
+      </w:pPr>
+      <w:r>
+        <w:t>Sync health: Admin sees the last sync time, rows read and any failure; users see "ZMMS data from dd Mon hh:mm". A failed sync keeps the previous data, retries, and warns Admin.</w:t>
+      </w:r>
+    </w:p>
+    <w:p>
+      <w:pPr>
+        <w:pStyle w:val="ListBullet"/>
+      </w:pPr>
+      <w:r>
+        <w:t>The ZMMS account is kept in the server configuration, never in code, logs or the browser.</w:t>
+      </w:r>
+    </w:p>
+    <w:p>
+      <w:pPr>
+        <w:pStyle w:val="ListBullet"/>
+      </w:pPr>
+      <w:r>
+        <w:t>Method: a ZMMS export or API if ZMMS offers one; otherwise the app reads the daily job page with the account. This needs the ZMMS owner's agreement (Q9).</w:t>
+      </w:r>
+    </w:p>
+    <w:p>
+      <w:pPr>
+        <w:pStyle w:val="Heading2"/>
+      </w:pPr>
+      <w:r>
+        <w:rPr>
+          <w:color w:val="1F3A5F"/>
+        </w:rPr>
+        <w:t>4.5 EQ status - automatic, with manual correction</w:t>
+      </w:r>
+    </w:p>
+    <w:p>
+      <w:pPr>
+        <w:pStyle w:val="ListBullet"/>
+      </w:pPr>
+      <w:r>
+        <w:t>After each sync the app sets each mapped equipment's status automatically: an open ZMMS breakdown job today -&gt; Breakdown; an open maintenance job today -&gt; Maintenance; otherwise Ready for OPS. Which ZMMS job types and statuses mean Breakdown or Maintenance is set in Admin (Q11).</w:t>
+      </w:r>
+    </w:p>
+    <w:p>
+      <w:pPr>
+        <w:pStyle w:val="ListBullet"/>
+      </w:pPr>
+      <w:r>
+        <w:t>If the automatic status is wrong, an EQ Team user changes it with a reason. The status then shows "Manual". It returns to automatic at the next sync that detects a different state for that equipment, or when a user selects "Back to automatic" (Q12).</w:t>
+      </w:r>
+    </w:p>
+    <w:p>
+      <w:pPr>
+        <w:pStyle w:val="ListBullet"/>
+      </w:pPr>
+      <w:r>
+        <w:t>Equipment with no ZMMS mapping keeps the V1 manual status.</w:t>
+      </w:r>
+    </w:p>
+    <w:p>
+      <w:pPr>
+        <w:pStyle w:val="ListBullet"/>
+      </w:pPr>
+      <w:r>
+        <w:t>The EQ status part of the Jobs tab lists every status change with its source (ZMMS sync or user), time and reason.</w:t>
+      </w:r>
+    </w:p>
+    <w:p>
+      <w:pPr>
+        <w:pStyle w:val="ListBullet"/>
+      </w:pPr>
+      <w:r>
+        <w:t>This replaces the V1 rule that the status is only set by hand and the "no telemetry" note on the Fleet tab.</w:t>
+      </w:r>
+    </w:p>
+    <w:p>
+      <w:pPr>
+        <w:pStyle w:val="Heading2"/>
+      </w:pPr>
+      <w:r>
+        <w:rPr>
+          <w:color w:val="1F3A5F"/>
+        </w:rPr>
+        <w:t>4.6 Condition of major spare parts</w:t>
+      </w:r>
+    </w:p>
+    <w:p>
+      <w:pPr>
+        <w:pStyle w:val="ListBullet"/>
+      </w:pPr>
+      <w:r>
+        <w:t>Admin marks which main-part positions of the mechanism tree are major spare parts (for example hoist motors, gearboxes, brakes, wire ropes, spreader). Each equipment has its own register.</w:t>
+      </w:r>
+    </w:p>
+    <w:p>
+      <w:pPr>
+        <w:pStyle w:val="ListBullet"/>
+      </w:pPr>
+      <w:r>
+        <w:t>Fields per part: Condition (Original / Replaced), brand, model or part number (optional), serial number (optional), replaced date (blank for Original), expected life in months, next predicted replacement, remarks.</w:t>
+      </w:r>
+    </w:p>
+    <w:p>
+      <w:pPr>
+        <w:pStyle w:val="ListBullet"/>
+      </w:pPr>
+      <w:r>
+        <w:t>Expected life is set per part type by Admin and can be changed per equipment. Next predicted replacement = replaced date + expected life; for an Original part the equipment's commissioning date is used. If that date is unknown, no prediction is shown (Q13).</w:t>
+      </w:r>
+    </w:p>
+    <w:p>
+      <w:pPr>
+        <w:pStyle w:val="ListBullet"/>
+      </w:pPr>
+      <w:r>
+        <w:t>Parts past their predicted date are marked overdue, and parts within 90 days are marked "due soon" (Admin setting).</w:t>
+      </w:r>
+    </w:p>
+    <w:p>
+      <w:pPr>
+        <w:pStyle w:val="ListBullet"/>
+      </w:pPr>
+      <w:r>
+        <w:t>The EQ Team updates the register directly or through a completed Replacement special job. Each change keeps the previous values, so the replacement history of a part is visible in this tab.</w:t>
+      </w:r>
+    </w:p>
+    <w:p>
+      <w:pPr>
+        <w:pStyle w:val="Heading1"/>
+      </w:pPr>
+      <w:r>
+        <w:rPr>
+          <w:color w:val="1F3A5F"/>
+        </w:rPr>
+        <w:t>4A Changes to V1 rules caused by section 4</w:t>
+      </w:r>
+    </w:p>
+    <w:tbl>
+      <w:tblPr>
+        <w:tblStyle w:val="TableGrid"/>
+        <w:tblW w:type="auto" w:w="0"/>
+        <w:tblLook w:firstColumn="1" w:firstRow="1" w:lastColumn="0" w:lastRow="0" w:noHBand="0" w:noVBand="1" w:val="04A0"/>
+      </w:tblPr>
+      <w:tblGrid>
+        <w:gridCol w:w="4986"/>
+        <w:gridCol w:w="4986"/>
+      </w:tblGrid>
+      <w:tr>
+        <w:tc>
+          <w:tcPr>
+            <w:tcW w:type="dxa" w:w="4986"/>
+            <w:shd w:val="clear" w:color="auto" w:fill="1F3A5F"/>
+          </w:tcPr>
+          <w:p>
+            <w:r>
+              <w:rPr>
+                <w:b/>
+                <w:color w:val="FFFFFF"/>
+              </w:rPr>
+            </w:r>
+            <w:r>
+              <w:rPr>
+                <w:b/>
+                <w:color w:val="FFFFFF"/>
+                <w:sz w:val="19"/>
+              </w:rPr>
+              <w:t>V1 / approved requirements v1.1</w:t>
+            </w:r>
+          </w:p>
+        </w:tc>
+        <w:tc>
+          <w:tcPr>
+            <w:tcW w:type="dxa" w:w="4986"/>
+            <w:shd w:val="clear" w:color="auto" w:fill="1F3A5F"/>
+          </w:tcPr>
+          <w:p>
+            <w:r>
+              <w:rPr>
+                <w:b/>
+                <w:color w:val="FFFFFF"/>
+              </w:rPr>
+            </w:r>
+            <w:r>
+              <w:rPr>
+                <w:b/>
+                <w:color w:val="FFFFFF"/>
+                <w:sz w:val="19"/>
+              </w:rPr>
+              <w:t>V2</w:t>
+            </w:r>
+          </w:p>
+        </w:tc>
+      </w:tr>
+      <w:tr>
+        <w:tc>
+          <w:tcPr>
+            <w:tcW w:type="dxa" w:w="4986"/>
+          </w:tcPr>
+          <w:p>
+            <w:r/>
+            <w:r>
+              <w:rPr>
+                <w:sz w:val="19"/>
+              </w:rPr>
+              <w:t>Operational status is set only manually; no telemetry</w:t>
+            </w:r>
+          </w:p>
+        </w:tc>
+        <w:tc>
+          <w:tcPr>
+            <w:tcW w:type="dxa" w:w="4986"/>
+          </w:tcPr>
+          <w:p>
+            <w:r/>
+            <w:r>
+              <w:rPr>
+                <w:sz w:val="19"/>
+              </w:rPr>
+              <w:t>Automatic from ZMMS daily jobs, with manual correction</w:t>
+            </w:r>
+          </w:p>
+        </w:tc>
+      </w:tr>
+      <w:tr>
+        <w:tc>
+          <w:tcPr>
+            <w:tcW w:type="dxa" w:w="4986"/>
+          </w:tcPr>
+          <w:p>
+            <w:r/>
+            <w:r>
+              <w:rPr>
+                <w:sz w:val="19"/>
+              </w:rPr>
+              <w:t>No external system link (Maximo/EAM)</w:t>
+            </w:r>
+          </w:p>
+        </w:tc>
+        <w:tc>
+          <w:tcPr>
+            <w:tcW w:type="dxa" w:w="4986"/>
+          </w:tcPr>
+          <w:p>
+            <w:r/>
+            <w:r>
+              <w:rPr>
+                <w:sz w:val="19"/>
+              </w:rPr>
+              <w:t>Still no Maximo/EAM link; ZMMS daily jobs are read (read-only)</w:t>
+            </w:r>
+          </w:p>
+        </w:tc>
+      </w:tr>
+      <w:tr>
+        <w:tc>
+          <w:tcPr>
+            <w:tcW w:type="dxa" w:w="4986"/>
+          </w:tcPr>
+          <w:p>
+            <w:r/>
+            <w:r>
+              <w:rPr>
+                <w:sz w:val="19"/>
+              </w:rPr>
+              <w:t>Right panel in the equipment view shows scoped history (S07)</w:t>
+            </w:r>
+          </w:p>
+        </w:tc>
+        <w:tc>
+          <w:tcPr>
+            <w:tcW w:type="dxa" w:w="4986"/>
+          </w:tcPr>
+          <w:p>
+            <w:r/>
+            <w:r>
+              <w:rPr>
+                <w:sz w:val="19"/>
+              </w:rPr>
+              <w:t>Right panel shows the current state; history in the Jobs tab</w:t>
+            </w:r>
+          </w:p>
+        </w:tc>
+      </w:tr>
+      <w:tr>
+        <w:tc>
+          <w:tcPr>
+            <w:tcW w:type="dxa" w:w="4986"/>
+          </w:tcPr>
+          <w:p>
+            <w:r/>
+            <w:r>
+              <w:rPr>
+                <w:sz w:val="19"/>
+              </w:rPr>
+              <w:t>Jobs workspace: Pending / Current / Completed for all work (S08)</w:t>
+            </w:r>
+          </w:p>
+        </w:tc>
+        <w:tc>
+          <w:tcPr>
+            <w:tcW w:type="dxa" w:w="4986"/>
+          </w:tcPr>
+          <w:p>
+            <w:r/>
+            <w:r>
+              <w:rPr>
+                <w:sz w:val="19"/>
+              </w:rPr>
+              <w:t>Special jobs keep those statuses; daily jobs come from ZMMS</w:t>
+            </w:r>
+          </w:p>
+        </w:tc>
+      </w:tr>
+      <w:tr>
+        <w:tc>
+          <w:tcPr>
+            <w:tcW w:type="dxa" w:w="4986"/>
+          </w:tcPr>
+          <w:p>
+            <w:r/>
+            <w:r>
+              <w:rPr>
+                <w:sz w:val="19"/>
+              </w:rPr>
+              <w:t>Remaining or predicted life not in stage 1</w:t>
+            </w:r>
+          </w:p>
+        </w:tc>
+        <w:tc>
+          <w:tcPr>
+            <w:tcW w:type="dxa" w:w="4986"/>
+          </w:tcPr>
+          <w:p>
+            <w:r/>
+            <w:r>
+              <w:rPr>
+                <w:sz w:val="19"/>
+              </w:rPr>
+              <w:t>Simple predicted replacement date from the expected life in months</w:t>
+            </w:r>
+          </w:p>
+        </w:tc>
+      </w:tr>
+    </w:tbl>
+    <w:p/>
     <w:p>
       <w:pPr>
         <w:pStyle w:val="Heading1"/>
@@ -2415,7 +2940,7 @@
               <w:rPr>
                 <w:sz w:val="19"/>
               </w:rPr>
-              <w:t>4 months (3 times a year) - confirm, Q3</w:t>
+              <w:t>4 months (3 times a year)</w:t>
             </w:r>
           </w:p>
         </w:tc>
@@ -2445,7 +2970,7 @@
               <w:rPr>
                 <w:sz w:val="19"/>
               </w:rPr>
-              <w:t>6 months (twice a year, as the sheet's +182 days) - confirm, Q3</w:t>
+              <w:t>6 months (twice a year, as the sheet's +182 days)</w:t>
             </w:r>
           </w:p>
         </w:tc>
@@ -2577,7 +3102,7 @@
         <w:pStyle w:val="ListBullet"/>
       </w:pPr>
       <w:r>
-        <w:t>Next due = last done date + interval, counted in calendar months (the sheet's +30/+31 days become "1 month").</w:t>
+        <w:t>When a user adds a new job, they choose its frequency from this list (Admin maintains the list).</w:t>
       </w:r>
     </w:p>
     <w:p>
@@ -2585,7 +3110,7 @@
         <w:pStyle w:val="ListBullet"/>
       </w:pPr>
       <w:r>
-        <w:t>When a cycle is completed, last done = completion date and the next cycle opens automatically as Pending (question Q4).</w:t>
+        <w:t>Recurring jobs only: next due = last done date + interval, counted in calendar months (the sheet's +30/+31 days become "1 month"). When a cycle is completed, last done = completion date and the next cycle opens automatically as Pending.</w:t>
       </w:r>
     </w:p>
     <w:p>
@@ -3181,7 +3706,7 @@
         <w:pStyle w:val="ListBullet"/>
       </w:pPr>
       <w:r>
-        <w:t>Own SQL Server database; no Maximo/EAM link.</w:t>
+        <w:t>Own SQL Server database; no Maximo/EAM link. The only external system the app reads is ZMMS (4.4).</w:t>
       </w:r>
     </w:p>
     <w:p>
@@ -3208,7 +3733,7 @@
         <w:pStyle w:val="ListBullet"/>
       </w:pPr>
       <w:r>
-        <w:t>EQ: V1 exclusions unchanged.</w:t>
+        <w:t>EQ: writing anything back to ZMMS; reading ZMMS jobs other than the daily job list; linking ZMMS daily jobs to mechanisms or parts; predictions from running hours, sensors or AI; spare-part stock and purchasing. Other V1 exclusions unchanged.</w:t>
       </w:r>
     </w:p>
     <w:p>
@@ -3308,7 +3833,7 @@
               <w:rPr>
                 <w:sz w:val="19"/>
               </w:rPr>
-              <w:t>Version 2.0: FAC scope items, FAC Team role, feature-permission matrix, FAC exclusions</w:t>
+              <w:t>Version 2.0: FAC scope items, FAC Team role, feature-permission matrix, EQ changes of section 4A, ZMMS read-only import, FAC exclusions</w:t>
             </w:r>
           </w:p>
         </w:tc>
@@ -3338,7 +3863,7 @@
               <w:rPr>
                 <w:sz w:val="19"/>
               </w:rPr>
-              <w:t>Addendum: FAC tables (jobs, cycles, updates, photos), FAC API, permission matrix</w:t>
+              <w:t>Addendum: FAC tables (jobs, cycles, updates, photos), FAC API, permission matrix, ZMMS daily jobs, status source, spare-part register</w:t>
             </w:r>
           </w:p>
         </w:tc>
@@ -3368,7 +3893,7 @@
               <w:rPr>
                 <w:sz w:val="19"/>
               </w:rPr>
-              <w:t>Section switch, FAC Dashboard and FAC Jobs prototype with the imported list</w:t>
+              <w:t>Section switch, FAC Dashboard and FAC Jobs prototype with the imported list; EQ Jobs tab in three parts; crane view without history</w:t>
             </w:r>
           </w:p>
         </w:tc>
@@ -3441,7 +3966,7 @@
               <w:rPr>
                 <w:sz w:val="19"/>
               </w:rPr>
-              <w:t>Access matrix, FAC master list and Excel import</w:t>
+              <w:t>Access matrix, FAC master list and Excel import, ZMMS equipment mapping and status rules, major spare-part selection and expected life</w:t>
             </w:r>
           </w:p>
         </w:tc>
@@ -3457,7 +3982,7 @@
               <w:rPr>
                 <w:sz w:val="19"/>
               </w:rPr>
-              <w:t>New FAC build phase</w:t>
+              <w:t>P07</w:t>
             </w:r>
           </w:p>
         </w:tc>
@@ -3471,7 +3996,7 @@
               <w:rPr>
                 <w:sz w:val="19"/>
               </w:rPr>
-              <w:t>FAC jobs, cycles, progress updates, photos</w:t>
+              <w:t>Special jobs, automatic/manual status, spare-part register</w:t>
             </w:r>
           </w:p>
         </w:tc>
@@ -3487,7 +4012,7 @@
               <w:rPr>
                 <w:sz w:val="19"/>
               </w:rPr>
-              <w:t>P09</w:t>
+              <w:t>New ZMMS phase</w:t>
             </w:r>
           </w:p>
         </w:tc>
@@ -3501,7 +4026,7 @@
               <w:rPr>
                 <w:sz w:val="19"/>
               </w:rPr>
-              <w:t>FAC Dashboard alongside the EQ Fleet tab</w:t>
+              <w:t>Daily sync with the separate account, mapping, sync health, automatic status</w:t>
             </w:r>
           </w:p>
         </w:tc>
@@ -3517,7 +4042,7 @@
               <w:rPr>
                 <w:sz w:val="19"/>
               </w:rPr>
-              <w:t>Reviews and acceptance</w:t>
+              <w:t>New FAC build phase</w:t>
             </w:r>
           </w:p>
         </w:tc>
@@ -3531,7 +4056,7 @@
               <w:rPr>
                 <w:sz w:val="19"/>
               </w:rPr>
-              <w:t>FAC acceptance cases; R02/R04 cover FAC</w:t>
+              <w:t>FAC jobs, cycles, progress updates, photos</w:t>
             </w:r>
           </w:p>
         </w:tc>
@@ -3547,7 +4072,7 @@
               <w:rPr>
                 <w:sz w:val="19"/>
               </w:rPr>
-              <w:t>U1 checkpoint</w:t>
+              <w:t>P09 / P10</w:t>
             </w:r>
           </w:p>
         </w:tc>
@@ -3561,7 +4086,67 @@
               <w:rPr>
                 <w:sz w:val="19"/>
               </w:rPr>
-              <w:t>Either approve the EQ prototype now and review FAC at a short extra checkpoint, or review both together after the FAC prototype (question Q8)</w:t>
+              <w:t>FAC Dashboard beside the EQ Fleet tab; right panel shows the current state only</w:t>
+            </w:r>
+          </w:p>
+        </w:tc>
+      </w:tr>
+      <w:tr>
+        <w:tc>
+          <w:tcPr>
+            <w:tcW w:type="dxa" w:w="4986"/>
+          </w:tcPr>
+          <w:p>
+            <w:r/>
+            <w:r>
+              <w:rPr>
+                <w:sz w:val="19"/>
+              </w:rPr>
+              <w:t>Reviews and acceptance</w:t>
+            </w:r>
+          </w:p>
+        </w:tc>
+        <w:tc>
+          <w:tcPr>
+            <w:tcW w:type="dxa" w:w="4986"/>
+          </w:tcPr>
+          <w:p>
+            <w:r/>
+            <w:r>
+              <w:rPr>
+                <w:sz w:val="19"/>
+              </w:rPr>
+              <w:t>FAC and ZMMS acceptance cases; reviews cover both</w:t>
+            </w:r>
+          </w:p>
+        </w:tc>
+      </w:tr>
+      <w:tr>
+        <w:tc>
+          <w:tcPr>
+            <w:tcW w:type="dxa" w:w="4986"/>
+          </w:tcPr>
+          <w:p>
+            <w:r/>
+            <w:r>
+              <w:rPr>
+                <w:sz w:val="19"/>
+              </w:rPr>
+              <w:t>Checkpoints</w:t>
+            </w:r>
+          </w:p>
+        </w:tc>
+        <w:tc>
+          <w:tcPr>
+            <w:tcW w:type="dxa" w:w="4986"/>
+          </w:tcPr>
+          <w:p>
+            <w:r/>
+            <w:r>
+              <w:rPr>
+                <w:sz w:val="19"/>
+              </w:rPr>
+              <w:t>Planned when the prompt pack is updated</w:t>
             </w:r>
           </w:p>
         </w:tc>
@@ -3576,7 +4161,18 @@
         <w:rPr>
           <w:color w:val="1F3A5F"/>
         </w:rPr>
-        <w:t>9 Decisions needed from you</w:t>
+        <w:t>9 Decisions</w:t>
+      </w:r>
+    </w:p>
+    <w:p>
+      <w:pPr>
+        <w:pStyle w:val="Heading2"/>
+      </w:pPr>
+      <w:r>
+        <w:rPr>
+          <w:color w:val="1F3A5F"/>
+        </w:rPr>
+        <w:t>9.1 Confirmed by you (22 October 2026)</w:t>
       </w:r>
     </w:p>
     <w:tbl>
@@ -3653,7 +4249,7 @@
                 <w:color w:val="FFFFFF"/>
                 <w:sz w:val="19"/>
               </w:rPr>
-              <w:t>Recommended answer</w:t>
+              <w:t>Your answer</w:t>
             </w:r>
           </w:p>
         </w:tc>
@@ -3697,7 +4293,7 @@
               <w:rPr>
                 <w:sz w:val="19"/>
               </w:rPr>
-              <w:t xml:space="preserve">Display "EQ &amp; FAC Maintenance"; keep technical code </w:t>
+              <w:t xml:space="preserve">Display "EQ &amp; FAC Maintenance"; technical code stays </w:t>
             </w:r>
             <w:r>
               <w:rPr>
@@ -3748,7 +4344,7 @@
               <w:rPr>
                 <w:sz w:val="19"/>
               </w:rPr>
-              <w:t>Admin; Admin can switch it on for FAC Team in Access</w:t>
+              <w:t>Admin; Admin can give the right to FAC Team in Access</w:t>
             </w:r>
           </w:p>
         </w:tc>
@@ -3778,7 +4374,7 @@
               <w:rPr>
                 <w:sz w:val="19"/>
               </w:rPr>
-              <w:t>Tri-annually and bi-annually</w:t>
+              <w:t>Frequencies</w:t>
             </w:r>
           </w:p>
         </w:tc>
@@ -3792,7 +4388,7 @@
               <w:rPr>
                 <w:sz w:val="19"/>
               </w:rPr>
-              <w:t>Tri-annually = every 4 months; bi-annually = every 6 months</w:t>
+              <w:t>Tri-annually = every 4 months; bi-annually = every 6 months; the user sets the frequency when adding a new job</w:t>
             </w:r>
           </w:p>
         </w:tc>
@@ -3822,7 +4418,7 @@
               <w:rPr>
                 <w:sz w:val="19"/>
               </w:rPr>
-              <w:t>Next due date counted from</w:t>
+              <w:t>Next due date</w:t>
             </w:r>
           </w:p>
         </w:tc>
@@ -3836,7 +4432,7 @@
               <w:rPr>
                 <w:sz w:val="19"/>
               </w:rPr>
-              <w:t>The actual completion date (as the sheet does), not a fixed calendar</w:t>
+              <w:t>From the actual completion date, for recurring jobs only</w:t>
             </w:r>
           </w:p>
         </w:tc>
@@ -3866,7 +4462,7 @@
               <w:rPr>
                 <w:sz w:val="19"/>
               </w:rPr>
-              <w:t>Gaps in the sheet (Appendix A)</w:t>
+              <w:t>Gaps in the sheet</w:t>
             </w:r>
           </w:p>
         </w:tc>
@@ -3880,7 +4476,7 @@
               <w:rPr>
                 <w:sz w:val="19"/>
               </w:rPr>
-              <w:t>Import with blanks (quantity 1, no PIC, no dates) and complete them in Admin</w:t>
+              <w:t>Import with blanks and complete them in Admin</w:t>
             </w:r>
           </w:p>
         </w:tc>
@@ -3924,7 +4520,7 @@
               <w:rPr>
                 <w:sz w:val="19"/>
               </w:rPr>
-              <w:t>Track them with a one-tap "Done today" / "Done this week"</w:t>
+              <w:t>One-tap "Done today" / "Done this week"</w:t>
             </w:r>
           </w:p>
         </w:tc>
@@ -3954,7 +4550,7 @@
               <w:rPr>
                 <w:sz w:val="19"/>
               </w:rPr>
-              <w:t>Management access to FAC Jobs</w:t>
+              <w:t>Management access to FAC</w:t>
             </w:r>
           </w:p>
         </w:tc>
@@ -3968,7 +4564,7 @@
               <w:rPr>
                 <w:sz w:val="19"/>
               </w:rPr>
-              <w:t>Both FAC tabs, read-only</w:t>
+              <w:t>Both FAC tabs, read-only; tab visibility adjustable in Admin</w:t>
             </w:r>
           </w:p>
         </w:tc>
@@ -4012,7 +4608,363 @@
               <w:rPr>
                 <w:sz w:val="19"/>
               </w:rPr>
-              <w:t>Finish the EQ U1 walkthrough now; review FAC at a short extra checkpoint after its prototype</w:t>
+              <w:t>Not decided now; this revision only updates the SOW</w:t>
+            </w:r>
+          </w:p>
+        </w:tc>
+      </w:tr>
+    </w:tbl>
+    <w:p/>
+    <w:p>
+      <w:pPr>
+        <w:pStyle w:val="Heading2"/>
+      </w:pPr>
+      <w:r>
+        <w:rPr>
+          <w:color w:val="1F3A5F"/>
+        </w:rPr>
+        <w:t>9.2 Still open (new in revision 2)</w:t>
+      </w:r>
+    </w:p>
+    <w:tbl>
+      <w:tblPr>
+        <w:tblStyle w:val="TableGrid"/>
+        <w:tblW w:type="auto" w:w="0"/>
+        <w:tblLook w:firstColumn="1" w:firstRow="1" w:lastColumn="0" w:lastRow="0" w:noHBand="0" w:noVBand="1" w:val="04A0"/>
+      </w:tblPr>
+      <w:tblGrid>
+        <w:gridCol w:w="3324"/>
+        <w:gridCol w:w="3324"/>
+        <w:gridCol w:w="3324"/>
+      </w:tblGrid>
+      <w:tr>
+        <w:tc>
+          <w:tcPr>
+            <w:tcW w:type="dxa" w:w="3324"/>
+            <w:shd w:val="clear" w:color="auto" w:fill="1F3A5F"/>
+          </w:tcPr>
+          <w:p>
+            <w:r>
+              <w:rPr>
+                <w:b/>
+                <w:color w:val="FFFFFF"/>
+              </w:rPr>
+            </w:r>
+            <w:r>
+              <w:rPr>
+                <w:b/>
+                <w:color w:val="FFFFFF"/>
+                <w:sz w:val="19"/>
+              </w:rPr>
+              <w:t>No.</w:t>
+            </w:r>
+          </w:p>
+        </w:tc>
+        <w:tc>
+          <w:tcPr>
+            <w:tcW w:type="dxa" w:w="3324"/>
+            <w:shd w:val="clear" w:color="auto" w:fill="1F3A5F"/>
+          </w:tcPr>
+          <w:p>
+            <w:r>
+              <w:rPr>
+                <w:b/>
+                <w:color w:val="FFFFFF"/>
+              </w:rPr>
+            </w:r>
+            <w:r>
+              <w:rPr>
+                <w:b/>
+                <w:color w:val="FFFFFF"/>
+                <w:sz w:val="19"/>
+              </w:rPr>
+              <w:t>Question</w:t>
+            </w:r>
+          </w:p>
+        </w:tc>
+        <w:tc>
+          <w:tcPr>
+            <w:tcW w:type="dxa" w:w="3324"/>
+            <w:shd w:val="clear" w:color="auto" w:fill="1F3A5F"/>
+          </w:tcPr>
+          <w:p>
+            <w:r>
+              <w:rPr>
+                <w:b/>
+                <w:color w:val="FFFFFF"/>
+              </w:rPr>
+            </w:r>
+            <w:r>
+              <w:rPr>
+                <w:b/>
+                <w:color w:val="FFFFFF"/>
+                <w:sz w:val="19"/>
+              </w:rPr>
+              <w:t>Recommended answer</w:t>
+            </w:r>
+          </w:p>
+        </w:tc>
+      </w:tr>
+      <w:tr>
+        <w:tc>
+          <w:tcPr>
+            <w:tcW w:type="dxa" w:w="3324"/>
+          </w:tcPr>
+          <w:p>
+            <w:r/>
+            <w:r>
+              <w:rPr>
+                <w:sz w:val="19"/>
+              </w:rPr>
+              <w:t>Q9</w:t>
+            </w:r>
+          </w:p>
+        </w:tc>
+        <w:tc>
+          <w:tcPr>
+            <w:tcW w:type="dxa" w:w="3324"/>
+          </w:tcPr>
+          <w:p>
+            <w:r/>
+            <w:r>
+              <w:rPr>
+                <w:sz w:val="19"/>
+              </w:rPr>
+              <w:t>ZMMS access</w:t>
+            </w:r>
+          </w:p>
+        </w:tc>
+        <w:tc>
+          <w:tcPr>
+            <w:tcW w:type="dxa" w:w="3324"/>
+          </w:tcPr>
+          <w:p>
+            <w:r/>
+            <w:r>
+              <w:rPr>
+                <w:sz w:val="19"/>
+              </w:rPr>
+              <w:t>You provide a read-only ZMMS account and confirm the ZMMS owner allows automated daily reading; tell us if ZMMS has an export or API</w:t>
+            </w:r>
+          </w:p>
+        </w:tc>
+      </w:tr>
+      <w:tr>
+        <w:tc>
+          <w:tcPr>
+            <w:tcW w:type="dxa" w:w="3324"/>
+          </w:tcPr>
+          <w:p>
+            <w:r/>
+            <w:r>
+              <w:rPr>
+                <w:sz w:val="19"/>
+              </w:rPr>
+              <w:t>Q10</w:t>
+            </w:r>
+          </w:p>
+        </w:tc>
+        <w:tc>
+          <w:tcPr>
+            <w:tcW w:type="dxa" w:w="3324"/>
+          </w:tcPr>
+          <w:p>
+            <w:r/>
+            <w:r>
+              <w:rPr>
+                <w:sz w:val="19"/>
+              </w:rPr>
+              <w:t>ZMMS sync timing</w:t>
+            </w:r>
+          </w:p>
+        </w:tc>
+        <w:tc>
+          <w:tcPr>
+            <w:tcW w:type="dxa" w:w="3324"/>
+          </w:tcPr>
+          <w:p>
+            <w:r/>
+            <w:r>
+              <w:rPr>
+                <w:sz w:val="19"/>
+              </w:rPr>
+              <w:t>Once a day at 06:00 plus Admin "Sync now"; Admin may set more syncs per day if status must follow ZMMS more closely</w:t>
+            </w:r>
+          </w:p>
+        </w:tc>
+      </w:tr>
+      <w:tr>
+        <w:tc>
+          <w:tcPr>
+            <w:tcW w:type="dxa" w:w="3324"/>
+          </w:tcPr>
+          <w:p>
+            <w:r/>
+            <w:r>
+              <w:rPr>
+                <w:sz w:val="19"/>
+              </w:rPr>
+              <w:t>Q11</w:t>
+            </w:r>
+          </w:p>
+        </w:tc>
+        <w:tc>
+          <w:tcPr>
+            <w:tcW w:type="dxa" w:w="3324"/>
+          </w:tcPr>
+          <w:p>
+            <w:r/>
+            <w:r>
+              <w:rPr>
+                <w:sz w:val="19"/>
+              </w:rPr>
+              <w:t>Which ZMMS jobs mean Breakdown or Maintenance</w:t>
+            </w:r>
+          </w:p>
+        </w:tc>
+        <w:tc>
+          <w:tcPr>
+            <w:tcW w:type="dxa" w:w="3324"/>
+          </w:tcPr>
+          <w:p>
+            <w:r/>
+            <w:r>
+              <w:rPr>
+                <w:sz w:val="19"/>
+              </w:rPr>
+              <w:t>Decided in Admin after the first sample of ZMMS data</w:t>
+            </w:r>
+          </w:p>
+        </w:tc>
+      </w:tr>
+      <w:tr>
+        <w:tc>
+          <w:tcPr>
+            <w:tcW w:type="dxa" w:w="3324"/>
+          </w:tcPr>
+          <w:p>
+            <w:r/>
+            <w:r>
+              <w:rPr>
+                <w:sz w:val="19"/>
+              </w:rPr>
+              <w:t>Q12</w:t>
+            </w:r>
+          </w:p>
+        </w:tc>
+        <w:tc>
+          <w:tcPr>
+            <w:tcW w:type="dxa" w:w="3324"/>
+          </w:tcPr>
+          <w:p>
+            <w:r/>
+            <w:r>
+              <w:rPr>
+                <w:sz w:val="19"/>
+              </w:rPr>
+              <w:t>How long a manual status correction lasts</w:t>
+            </w:r>
+          </w:p>
+        </w:tc>
+        <w:tc>
+          <w:tcPr>
+            <w:tcW w:type="dxa" w:w="3324"/>
+          </w:tcPr>
+          <w:p>
+            <w:r/>
+            <w:r>
+              <w:rPr>
+                <w:sz w:val="19"/>
+              </w:rPr>
+              <w:t>Until the next sync detects a different state for that equipment, or "Back to automatic"</w:t>
+            </w:r>
+          </w:p>
+        </w:tc>
+      </w:tr>
+      <w:tr>
+        <w:tc>
+          <w:tcPr>
+            <w:tcW w:type="dxa" w:w="3324"/>
+          </w:tcPr>
+          <w:p>
+            <w:r/>
+            <w:r>
+              <w:rPr>
+                <w:sz w:val="19"/>
+              </w:rPr>
+              <w:t>Q13</w:t>
+            </w:r>
+          </w:p>
+        </w:tc>
+        <w:tc>
+          <w:tcPr>
+            <w:tcW w:type="dxa" w:w="3324"/>
+          </w:tcPr>
+          <w:p>
+            <w:r/>
+            <w:r>
+              <w:rPr>
+                <w:sz w:val="19"/>
+              </w:rPr>
+              <w:t>Basis for the next predicted replacement</w:t>
+            </w:r>
+          </w:p>
+        </w:tc>
+        <w:tc>
+          <w:tcPr>
+            <w:tcW w:type="dxa" w:w="3324"/>
+          </w:tcPr>
+          <w:p>
+            <w:r/>
+            <w:r>
+              <w:rPr>
+                <w:sz w:val="19"/>
+              </w:rPr>
+              <w:t>Expected life in months; Original parts count from the commissioning date</w:t>
+            </w:r>
+          </w:p>
+        </w:tc>
+      </w:tr>
+      <w:tr>
+        <w:tc>
+          <w:tcPr>
+            <w:tcW w:type="dxa" w:w="3324"/>
+          </w:tcPr>
+          <w:p>
+            <w:r/>
+            <w:r>
+              <w:rPr>
+                <w:sz w:val="19"/>
+              </w:rPr>
+              <w:t>Q14</w:t>
+            </w:r>
+          </w:p>
+        </w:tc>
+        <w:tc>
+          <w:tcPr>
+            <w:tcW w:type="dxa" w:w="3324"/>
+          </w:tcPr>
+          <w:p>
+            <w:r/>
+            <w:r>
+              <w:rPr>
+                <w:sz w:val="19"/>
+              </w:rPr>
+              <w:t>Which parts are "major spare parts"</w:t>
+            </w:r>
+          </w:p>
+        </w:tc>
+        <w:tc>
+          <w:tcPr>
+            <w:tcW w:type="dxa" w:w="3324"/>
+          </w:tcPr>
+          <w:p>
+            <w:r/>
+            <w:r>
+              <w:rPr>
+                <w:sz w:val="19"/>
+              </w:rPr>
+              <w:t>Admin selects them from the mechanism-tree part positions</w:t>
             </w:r>
           </w:p>
         </w:tc>

</xml_diff>

<commit_message>
SOW V2 revision 3: user answers Q9-Q14
Co-Authored-By: Claude Opus 5.5 <noreply@anthropic.com>
</commit_message>
<xml_diff>
--- a/docs/SOW_V2.docx
+++ b/docs/SOW_V2.docx
@@ -15,7 +15,7 @@
     </w:p>
     <w:p>
       <w:r>
-        <w:t>Version 2.0 DRAFT, revision 2 | 22 October 2026 | For user confirmation</w:t>
+        <w:t>Version 2.0 DRAFT, revision 3 | 22 October 2026 | For user confirmation</w:t>
       </w:r>
     </w:p>
     <w:p>
@@ -34,7 +34,7 @@
     </w:p>
     <w:p>
       <w:r>
-        <w:t>Revision 2 records your answers to Q1-Q8 (section 9) and adds the EQ Jobs tab changes: special jobs, daily jobs read from ZMMS, automatic EQ status and the spare-part condition register (section 4).</w:t>
+        <w:t>Revision 2 records your answers to Q1-Q8 (section 9) and adds the EQ Jobs tab changes: special jobs, daily jobs read from ZMMS, automatic EQ status and the spare-part condition register (section 4). Revision 3 records your answers to Q9-Q14: two ZMMS syncs a day, and a manual status correction that lasts for the current day only.</w:t>
       </w:r>
     </w:p>
     <w:p>
@@ -1585,7 +1585,7 @@
         <w:t>https://www.zmms.lk/?r=job/daily-alljob</w:t>
       </w:r>
       <w:r>
-        <w:t>. The page needs a login (checked 22 October 2026); you provide a separate account for this.</w:t>
+        <w:t>. The page needs a login (checked 22 October 2026). You have provided an account for this; its details are not written into this document or the project files.</w:t>
       </w:r>
     </w:p>
     <w:p>
@@ -1593,7 +1593,7 @@
         <w:pStyle w:val="ListBullet"/>
       </w:pPr>
       <w:r>
-        <w:t>The app server reads the list automatically once a day (default 06:00 Asia/Colombo; Admin can change the time and press "Sync now"). Reading only - the app never writes to ZMMS.</w:t>
+        <w:t>The app server reads the list automatically twice a day (defaults 06:00 and 14:00 Asia/Colombo; Admin can change both times and press "Sync now"). Reading only - the app never writes to ZMMS.</w:t>
       </w:r>
     </w:p>
     <w:p>
@@ -1660,7 +1660,7 @@
         <w:pStyle w:val="ListBullet"/>
       </w:pPr>
       <w:r>
-        <w:t>After each sync the app sets each mapped equipment's status automatically: an open ZMMS breakdown job today -&gt; Breakdown; an open maintenance job today -&gt; Maintenance; otherwise Ready for OPS. Which ZMMS job types and statuses mean Breakdown or Maintenance is set in Admin (Q11).</w:t>
+        <w:t>After each sync the app sets each mapped equipment's status from the day's ZMMS plan: a breakdown job -&gt; Breakdown; a maintenance job -&gt; Maintenance; equipment not in the day's plan -&gt; Ready for OPS (in operations). Which ZMMS job types and statuses mean Breakdown or Maintenance is set in Admin after the first real ZMMS data (Q11).</w:t>
       </w:r>
     </w:p>
     <w:p>
@@ -1668,7 +1668,7 @@
         <w:pStyle w:val="ListBullet"/>
       </w:pPr>
       <w:r>
-        <w:t>If the automatic status is wrong, an EQ Team user changes it with a reason. The status then shows "Manual". It returns to automatic at the next sync that detects a different state for that equipment, or when a user selects "Back to automatic" (Q12).</w:t>
+        <w:t>If the automatic status is wrong, an EQ Team user changes it with a reason. The status then shows "Manual" for the rest of that day, including over that day's second sync. At the first sync of the next day the equipment returns to automatic status (Q12). A user can also select "Back to automatic" earlier.</w:t>
       </w:r>
     </w:p>
     <w:p>
@@ -4623,7 +4623,7 @@
         <w:rPr>
           <w:color w:val="1F3A5F"/>
         </w:rPr>
-        <w:t>9.2 Still open (new in revision 2)</w:t>
+        <w:t>9.2 Confirmed by you (22 October 2026, revision 3)</w:t>
       </w:r>
     </w:p>
     <w:tbl>
@@ -4700,7 +4700,7 @@
                 <w:color w:val="FFFFFF"/>
                 <w:sz w:val="19"/>
               </w:rPr>
-              <w:t>Recommended answer</w:t>
+              <w:t>Your answer</w:t>
             </w:r>
           </w:p>
         </w:tc>
@@ -4744,7 +4744,7 @@
               <w:rPr>
                 <w:sz w:val="19"/>
               </w:rPr>
-              <w:t>You provide a read-only ZMMS account and confirm the ZMMS owner allows automated daily reading; tell us if ZMMS has an export or API</w:t>
+              <w:t>Account provided (details kept out of the documents; entered only in the server configuration at implementation)</w:t>
             </w:r>
           </w:p>
         </w:tc>
@@ -4788,7 +4788,7 @@
               <w:rPr>
                 <w:sz w:val="19"/>
               </w:rPr>
-              <w:t>Once a day at 06:00 plus Admin "Sync now"; Admin may set more syncs per day if status must follow ZMMS more closely</w:t>
+              <w:t>Twice a day; Admin can change the times</w:t>
             </w:r>
           </w:p>
         </w:tc>
@@ -4832,7 +4832,7 @@
               <w:rPr>
                 <w:sz w:val="19"/>
               </w:rPr>
-              <w:t>Decided in Admin after the first sample of ZMMS data</w:t>
+              <w:t>Set in Admin after the first real ZMMS data</w:t>
             </w:r>
           </w:p>
         </w:tc>
@@ -4876,7 +4876,7 @@
               <w:rPr>
                 <w:sz w:val="19"/>
               </w:rPr>
-              <w:t>Until the next sync detects a different state for that equipment, or "Back to automatic"</w:t>
+              <w:t>The current day only; next day the ZMMS plan decides, and equipment not in the plan is Ready for OPS</w:t>
             </w:r>
           </w:p>
         </w:tc>
@@ -4920,7 +4920,7 @@
               <w:rPr>
                 <w:sz w:val="19"/>
               </w:rPr>
-              <w:t>Expected life in months; Original parts count from the commissioning date</w:t>
+              <w:t>Replaced date + expected life in months; Original parts count from the commissioning date</w:t>
             </w:r>
           </w:p>
         </w:tc>
@@ -4971,6 +4971,33 @@
       </w:tr>
     </w:tbl>
     <w:p/>
+    <w:p>
+      <w:pPr>
+        <w:pStyle w:val="Heading2"/>
+      </w:pPr>
+      <w:r>
+        <w:rPr>
+          <w:color w:val="1F3A5F"/>
+        </w:rPr>
+        <w:t>9.3 Still to confirm during implementation</w:t>
+      </w:r>
+    </w:p>
+    <w:p>
+      <w:pPr>
+        <w:pStyle w:val="ListBullet"/>
+      </w:pPr>
+      <w:r>
+        <w:t>Whether the ZMMS owner agrees to the app reading the daily job list automatically with this account.</w:t>
+      </w:r>
+    </w:p>
+    <w:p>
+      <w:pPr>
+        <w:pStyle w:val="ListBullet"/>
+      </w:pPr>
+      <w:r>
+        <w:t>Whether ZMMS offers an export or API; if not, the app reads the daily job page (4.4).</w:t>
+      </w:r>
+    </w:p>
     <w:p>
       <w:pPr>
         <w:pStyle w:val="Heading1"/>

</xml_diff>

<commit_message>
SOW V2 revision 4: ZMMS read by login, owner agreed, no API
Co-Authored-By: Claude Opus 5.5 <noreply@anthropic.com>
</commit_message>
<xml_diff>
--- a/docs/SOW_V2.docx
+++ b/docs/SOW_V2.docx
@@ -15,7 +15,7 @@
     </w:p>
     <w:p>
       <w:r>
-        <w:t>Version 2.0 DRAFT, revision 3 | 22 October 2026 | For user confirmation</w:t>
+        <w:t>Version 2.0 DRAFT, revision 4 | 22 October 2026 | For user confirmation</w:t>
       </w:r>
     </w:p>
     <w:p>
@@ -34,7 +34,7 @@
     </w:p>
     <w:p>
       <w:r>
-        <w:t>Revision 2 records your answers to Q1-Q8 (section 9) and adds the EQ Jobs tab changes: special jobs, daily jobs read from ZMMS, automatic EQ status and the spare-part condition register (section 4). Revision 3 records your answers to Q9-Q14: two ZMMS syncs a day, and a manual status correction that lasts for the current day only.</w:t>
+        <w:t>Revision 2 records your answers to Q1-Q8 (section 9) and adds the EQ Jobs tab changes: special jobs, daily jobs read from ZMMS, automatic EQ status and the spare-part condition register (section 4). Revision 3 records your answers to Q9-Q14: two ZMMS syncs a day, and a manual status correction that lasts for the current day only. Revision 4 records that ZMMS is a CICT-owned app, you as its owner allow the app to read it with the login, and ZMMS has no API.</w:t>
       </w:r>
     </w:p>
     <w:p>
@@ -1641,7 +1641,7 @@
         <w:pStyle w:val="ListBullet"/>
       </w:pPr>
       <w:r>
-        <w:t>Method: a ZMMS export or API if ZMMS offers one; otherwise the app reads the daily job page with the account. This needs the ZMMS owner's agreement (Q9).</w:t>
+        <w:t>Method: ZMMS is a CICT-owned app with no API. As its owner you have agreed that this app signs in with the account and reads the daily job page. If the ZMMS page layout changes, the sync reports a failure to Admin instead of saving wrong data.</w:t>
       </w:r>
     </w:p>
     <w:p>
@@ -4979,7 +4979,7 @@
         <w:rPr>
           <w:color w:val="1F3A5F"/>
         </w:rPr>
-        <w:t>9.3 Still to confirm during implementation</w:t>
+        <w:t>9.3 ZMMS ownership and access (revision 4)</w:t>
       </w:r>
     </w:p>
     <w:p>
@@ -4987,7 +4987,7 @@
         <w:pStyle w:val="ListBullet"/>
       </w:pPr>
       <w:r>
-        <w:t>Whether the ZMMS owner agrees to the app reading the daily job list automatically with this account.</w:t>
+        <w:t>ZMMS is a CICT-owned app; you are its owner and have agreed to this app reading it with the login.</w:t>
       </w:r>
     </w:p>
     <w:p>
@@ -4995,7 +4995,7 @@
         <w:pStyle w:val="ListBullet"/>
       </w:pPr>
       <w:r>
-        <w:t>Whether ZMMS offers an export or API; if not, the app reads the daily job page (4.4).</w:t>
+        <w:t>ZMMS has no API or export, so the app signs in and reads the daily job page (4.4).</w:t>
       </w:r>
     </w:p>
     <w:p>

</xml_diff>

<commit_message>
U1-T01 BUILD: add temporary management Portal walkthrough
Add the isolated local login and four-card launcher using existing Portal appearance. Preserve EQ/FAC runtime workflows and explicit app links; record TD01-TD06 evidence and reversible temporary patches.

Include the user-authorized SOW V2 revision 6 and prompt pack 2.2 documentation, management-feedback handling and prior scope verification records.

U1 remains unapproved. P04/P05 remain unstarted. Removal is a separate required task before U1 approval and must retain accepted EQ/FAC refinements.

Co-Authored-By: Codex <noreply@openai.com>
</commit_message>
<xml_diff>
--- a/docs/SOW_V2.docx
+++ b/docs/SOW_V2.docx
@@ -8,28 +8,19 @@
       </w:pPr>
       <w:r>
         <w:rPr>
-          <w:color w:val="1F3A5F"/>
+          <w:color w:val="000000"/>
         </w:rPr>
         <w:t>CICT EQ &amp; FAC Maintenance - Scope of Work V2</w:t>
       </w:r>
     </w:p>
     <w:p>
       <w:r>
-        <w:t>Version 2.0 DRAFT, revision 4 | 22 October 2026 | For user confirmation</w:t>
+        <w:t>Version 2.0, revision 6 | 24 October 2026 | Temporary walkthrough and management feedback handling</w:t>
       </w:r>
     </w:p>
     <w:p>
       <w:r>
-        <w:t>Supersedes SOW V1 (</w:t>
-      </w:r>
-      <w:r>
-        <w:rPr>
-          <w:rFonts w:ascii="Consolas" w:hAnsi="Consolas"/>
-        </w:rPr>
-        <w:t>documents/SOW.docx</w:t>
-      </w:r>
-      <w:r>
-        <w:t>) only on the points below. Everything in V1, in the approved requirements v1.1 and in the confirmed U1 changes (U1-C01 to U1-C16) stays valid for the EQ section unless this document says otherwise. The prompt pack is not changed until you confirm this SOW.</w:t>
+        <w:t>Supersedes SOW V1 (documents/SOW.docx) only on the points below. Revision 4 was confirmed on 22 October 2026 and translated into prompt pack 2.0. The committed U1 refinements through U1-C58 remain the app baseline. Revision 5 adds the temporary management walkthrough in section 2A. Revision 6 clarifies that accepted EQ/FAC management feedback remains in the U1 app while login/Portal feedback is deferred to P05; prompt pack 2.2 reflects this. U1 remains unapproved.</w:t>
       </w:r>
     </w:p>
     <w:p>
@@ -43,7 +34,7 @@
       </w:pPr>
       <w:r>
         <w:rPr>
-          <w:color w:val="1F3A5F"/>
+          <w:color w:val="000000"/>
         </w:rPr>
         <w:t>1 What changes in V2</w:t>
       </w:r>
@@ -155,12 +146,15 @@
       </w:pPr>
       <w:r>
         <w:rPr>
-          <w:color w:val="1F3A5F"/>
+          <w:color w:val="000000"/>
         </w:rPr>
         <w:t>2 Application structure</w:t>
       </w:r>
     </w:p>
     <w:p>
+      <w:pPr>
+        <w:keepLines/>
+      </w:pPr>
       <w:r>
         <w:rPr>
           <w:rFonts w:ascii="Consolas" w:hAnsi="Consolas"/>
@@ -243,7 +237,116 @@
       </w:pPr>
       <w:r>
         <w:rPr>
-          <w:color w:val="1F3A5F"/>
+          <w:color w:val="000000"/>
+        </w:rPr>
+        <w:t>2A Temporary management walkthrough before U1 approval</w:t>
+      </w:r>
+    </w:p>
+    <w:p>
+      <w:pPr/>
+      <w:r>
+        <w:t>Revision 5 adds a temporary local presentation flow so management can see the journey from the ENG Portal into the existing EQ &amp; FAC Maintenance prototype. This is a pre-U1 demonstration step, not approval of U1 or delivery of real Portal integration.</w:t>
+      </w:r>
+    </w:p>
+    <w:p>
+      <w:pPr>
+        <w:pStyle w:val="ListBullet"/>
+        <w:keepLines/>
+      </w:pPr>
+      <w:r>
+        <w:t>Opening http://127.0.0.1:5312/ shows the same login-screen design as the existing ENG Portal in F:\CODEX\CICT-ENG_MAIN_PAGE: branding, layout, fields and sign-in control. No username/password configuration is needed. Pressing the login/sign-in control proceeds with both fields blank, with only one field filled, or with any text. Neither browser form validation nor application logic may check the credentials. Values are not sent, stored or logged.</w:t>
+      </w:r>
+    </w:p>
+    <w:p>
+      <w:pPr>
+        <w:pStyle w:val="ListBullet"/>
+        <w:keepLines/>
+      </w:pPr>
+      <w:r>
+        <w:t>The next screen matches the existing ENG Portal launcher and shows its three existing application cards: UMMS (Urgent Materials Monitor), PayPrep Assistant, and Safety Inspection &amp; Rectification Tracker. These are presentation-only cards and do not open or contact their working apps.</w:t>
+      </w:r>
+    </w:p>
+    <w:p>
+      <w:pPr>
+        <w:pStyle w:val="ListBullet"/>
+        <w:keepLines/>
+      </w:pPr>
+      <w:r>
+        <w:t>Add one card, EQ &amp; FAC Maintenance, in the same card style. Clicking it opens the existing app's default screen, EQ Fleet on a fresh visit, using the prototype's existing default persona and landing rules. The temporary wrapper itself does not change EQ/FAC screens, workflows, permissions, fixtures or model behaviour; accepted management feedback is handled as separate U1 app changes below.</w:t>
+      </w:r>
+    </w:p>
+    <w:p>
+      <w:pPr>
+        <w:pStyle w:val="ListBullet"/>
+        <w:keepLines/>
+      </w:pPr>
+      <w:r>
+        <w:t>Do not implement Portal administration, user creation, role assignment, password/reset/change flows, account provisioning, real authentication, or other Portal features. The Portal source is a read-only visual reference; all temporary files belong in the EQ workspace. Existing EQ/FAC prototype functions remain available as committed.</w:t>
+      </w:r>
+    </w:p>
+    <w:p>
+      <w:pPr>
+        <w:pStyle w:val="ListBullet"/>
+        <w:keepLines/>
+      </w:pPr>
+      <w:r>
+        <w:t>The initial app baseline is 8303f8b8a55f41983bdcc77363ddbf13d2892383 (24 October 2026, through U1-C58). Keep separate records of temporary wrapper edits and accepted EQ/FAC changes, including patches and verification, so cleanup removes only the temporary layer. The app submitted to U1 includes any subsequently accepted EQ/FAC refinements.</w:t>
+      </w:r>
+    </w:p>
+    <w:p>
+      <w:pPr>
+        <w:pStyle w:val="ListBullet"/>
+        <w:keepLines/>
+      </w:pPr>
+      <w:r>
+        <w:t>After the management demonstration and before recording U1 approval, remove the temporary login, Portal launcher, fourth-card wiring, copied assets and related state, flags or server hooks. Preserve every accepted EQ/FAC refinement, including changes in files also touched by the wrapper. Verify direct EQ/FAC entry at http://127.0.0.1:5312/ and review each remaining difference from the initial baseline against an accepted U1 change. Submit that cleaned app for U1 approval. Never restore whole files or reset the repository in a way that loses accepted app changes or unrelated work; keep documentation/evidence history.</w:t>
+      </w:r>
+    </w:p>
+    <w:p>
+      <w:pPr/>
+      <w:r>
+        <w:t>The detailed build/removal instructions and temporary checks TD01-TD08 are in documents/prompt-pack/TEMP_MANAGEMENT_WALKTHROUGH.md. All eight checks start NOT RUN. The permanent roles, server authorization, P05 integration and later acceptance requirements still apply to the working application.</w:t>
+      </w:r>
+    </w:p>
+    <w:p>
+      <w:pPr>
+        <w:pStyle w:val="Heading2"/>
+      </w:pPr>
+      <w:r>
+        <w:t>Management feedback during the walkthrough</w:t>
+      </w:r>
+    </w:p>
+    <w:p>
+      <w:pPr>
+        <w:pStyle w:val="ListBullet"/>
+      </w:pPr>
+      <w:r>
+        <w:t>Record each EQ/FAC request with an ID, affected screen/workflow, the requested outcome and acceptance criteria in docs/MANAGEMENT_FEEDBACK.md. You decide whether to accept it for U1, defer it to a later phase, or reject it. Management feedback does not itself approve U1.</w:t>
+      </w:r>
+    </w:p>
+    <w:p>
+      <w:pPr>
+        <w:pStyle w:val="ListBullet"/>
+      </w:pPr>
+      <w:r>
+        <w:t>Implement accepted prototype changes through the existing U1 refinement/Repair process. Update the SOW, prompt pack and affected UX/data/API records when the requirement changes; check the affected EQ/FAC flows and Flat/3D parity as relevant, then demonstrate the result again. Keep accepted refinements after temporary-wrapper cleanup. Production functionality still follows its gated build/review phases; a larger scope addition must be recorded and accepted before implementation.</w:t>
+      </w:r>
+    </w:p>
+    <w:p>
+      <w:pPr>
+        <w:pStyle w:val="ListBullet"/>
+      </w:pPr>
+      <w:r>
+        <w:t>Record login-screen, Portal layout/cards, account, role and authentication feedback separately for actual Portal integration in P05 and the relevant review/later phases. Do not implement that feedback in this temporary wrapper. A functional/safety defect that prevents the already-specified demo path may be corrected without expanding its scope.</w:t>
+      </w:r>
+    </w:p>
+    <w:p>
+      <w:pPr>
+        <w:pStyle w:val="Heading1"/>
+      </w:pPr>
+      <w:r>
+        <w:rPr>
+          <w:color w:val="000000"/>
         </w:rPr>
         <w:t>3 Roles and permissions</w:t>
       </w:r>
@@ -254,7 +357,7 @@
       </w:pPr>
       <w:r>
         <w:rPr>
-          <w:color w:val="1F3A5F"/>
+          <w:color w:val="000000"/>
         </w:rPr>
         <w:t>3.1 Portal: main role assignment</w:t>
       </w:r>
@@ -532,7 +635,7 @@
       </w:pPr>
       <w:r>
         <w:rPr>
-          <w:color w:val="1F3A5F"/>
+          <w:color w:val="000000"/>
         </w:rPr>
         <w:t>3.2 App Admin: feature permissions (Admin &gt; Access)</w:t>
       </w:r>
@@ -1437,7 +1540,7 @@
       </w:pPr>
       <w:r>
         <w:rPr>
-          <w:color w:val="1F3A5F"/>
+          <w:color w:val="000000"/>
         </w:rPr>
         <w:t>4 EQ section</w:t>
       </w:r>
@@ -1453,7 +1556,7 @@
       </w:pPr>
       <w:r>
         <w:rPr>
-          <w:color w:val="1F3A5F"/>
+          <w:color w:val="000000"/>
         </w:rPr>
         <w:t>4.1 Crane view: current state only</w:t>
       </w:r>
@@ -1488,12 +1591,15 @@
       </w:pPr>
       <w:r>
         <w:rPr>
-          <w:color w:val="1F3A5F"/>
+          <w:color w:val="000000"/>
         </w:rPr>
         <w:t>4.2 EQ Jobs tab - three parts</w:t>
       </w:r>
     </w:p>
     <w:p>
+      <w:pPr>
+        <w:keepLines/>
+      </w:pPr>
       <w:r>
         <w:rPr>
           <w:rFonts w:ascii="Consolas" w:hAnsi="Consolas"/>
@@ -1523,7 +1629,7 @@
       </w:pPr>
       <w:r>
         <w:rPr>
-          <w:color w:val="1F3A5F"/>
+          <w:color w:val="000000"/>
         </w:rPr>
         <w:t>4.3 Special jobs (manual)</w:t>
       </w:r>
@@ -1566,7 +1672,7 @@
       </w:pPr>
       <w:r>
         <w:rPr>
-          <w:color w:val="1F3A5F"/>
+          <w:color w:val="000000"/>
         </w:rPr>
         <w:t>4.4 Daily maintenance jobs (from ZMMS)</w:t>
       </w:r>
@@ -1650,7 +1756,7 @@
       </w:pPr>
       <w:r>
         <w:rPr>
-          <w:color w:val="1F3A5F"/>
+          <w:color w:val="000000"/>
         </w:rPr>
         <w:t>4.5 EQ status - automatic, with manual correction</w:t>
       </w:r>
@@ -1701,7 +1807,7 @@
       </w:pPr>
       <w:r>
         <w:rPr>
-          <w:color w:val="1F3A5F"/>
+          <w:color w:val="000000"/>
         </w:rPr>
         <w:t>4.6 Condition of major spare parts</w:t>
       </w:r>
@@ -1752,7 +1858,7 @@
       </w:pPr>
       <w:r>
         <w:rPr>
-          <w:color w:val="1F3A5F"/>
+          <w:color w:val="000000"/>
         </w:rPr>
         <w:t>4A Changes to V1 rules caused by section 4</w:t>
       </w:r>
@@ -1971,7 +2077,7 @@
       </w:pPr>
       <w:r>
         <w:rPr>
-          <w:color w:val="1F3A5F"/>
+          <w:color w:val="000000"/>
         </w:rPr>
         <w:t>5 FAC section</w:t>
       </w:r>
@@ -1982,7 +2088,7 @@
       </w:pPr>
       <w:r>
         <w:rPr>
-          <w:color w:val="1F3A5F"/>
+          <w:color w:val="000000"/>
         </w:rPr>
         <w:t>5.1 FAC job - the only fields</w:t>
       </w:r>
@@ -2734,7 +2840,7 @@
       </w:pPr>
       <w:r>
         <w:rPr>
-          <w:color w:val="1F3A5F"/>
+          <w:color w:val="000000"/>
         </w:rPr>
         <w:t>5.2 Frequency and due date</w:t>
       </w:r>
@@ -3159,7 +3265,7 @@
       </w:pPr>
       <w:r>
         <w:rPr>
-          <w:color w:val="1F3A5F"/>
+          <w:color w:val="000000"/>
         </w:rPr>
         <w:t>5.3 Status and progress</w:t>
       </w:r>
@@ -3281,7 +3387,7 @@
       </w:pPr>
       <w:r>
         <w:rPr>
-          <w:color w:val="1F3A5F"/>
+          <w:color w:val="000000"/>
         </w:rPr>
         <w:t>5.4 Pictures</w:t>
       </w:r>
@@ -3344,7 +3450,7 @@
       </w:pPr>
       <w:r>
         <w:rPr>
-          <w:color w:val="1F3A5F"/>
+          <w:color w:val="000000"/>
         </w:rPr>
         <w:t>5.5 FAC Dashboard - for management</w:t>
       </w:r>
@@ -3355,6 +3461,9 @@
       </w:r>
     </w:p>
     <w:p>
+      <w:pPr>
+        <w:keepLines/>
+      </w:pPr>
       <w:r>
         <w:rPr>
           <w:rFonts w:ascii="Consolas" w:hAnsi="Consolas"/>
@@ -3529,7 +3638,7 @@
       </w:pPr>
       <w:r>
         <w:rPr>
-          <w:color w:val="1F3A5F"/>
+          <w:color w:val="000000"/>
         </w:rPr>
         <w:t>5.6 FAC Jobs tab - for the FAC Team</w:t>
       </w:r>
@@ -3605,7 +3714,7 @@
       </w:pPr>
       <w:r>
         <w:rPr>
-          <w:color w:val="1F3A5F"/>
+          <w:color w:val="000000"/>
         </w:rPr>
         <w:t>5.7 FAC settings in Admin</w:t>
       </w:r>
@@ -3656,7 +3765,7 @@
       </w:pPr>
       <w:r>
         <w:rPr>
-          <w:color w:val="1F3A5F"/>
+          <w:color w:val="000000"/>
         </w:rPr>
         <w:t>6 Shared rules (both sections)</w:t>
       </w:r>
@@ -3666,7 +3775,7 @@
         <w:pStyle w:val="ListBullet"/>
       </w:pPr>
       <w:r>
-        <w:t>Sign-in only through the ENG Portal; permission checks on the server for every page, API call and photo.</w:t>
+        <w:t>Working application: sign-in only through the ENG Portal; permission checks on the server for every page, API call and photo. Section 2A is a temporary local presentation exception and must be removed before U1 approval.</w:t>
       </w:r>
     </w:p>
     <w:p>
@@ -3715,7 +3824,7 @@
       </w:pPr>
       <w:r>
         <w:rPr>
-          <w:color w:val="1F3A5F"/>
+          <w:color w:val="000000"/>
         </w:rPr>
         <w:t>7 Not in V2</w:t>
       </w:r>
@@ -3742,14 +3851,14 @@
       </w:pPr>
       <w:r>
         <w:rPr>
-          <w:color w:val="1F3A5F"/>
+          <w:color w:val="000000"/>
         </w:rPr>
-        <w:t>8 Effect on the implementation plan (information only - the prompt pack is not changed yet)</w:t>
+        <w:t>8 Effect on the implementation plan</w:t>
       </w:r>
     </w:p>
     <w:p>
       <w:r>
-        <w:t>After you confirm this SOW, the pack is updated as follows. Completed work (P00-P03 and the U1 repairs) stays valid.</w:t>
+        <w:t>The permanent V2 changes below were translated into prompt pack 2.0 after revision 4 was confirmed. Pack 2.2 includes the temporary walkthrough, removal gate and management feedback rules. Completed work and the committed U1 refinements stay valid; the temporary presentation is excluded from U1 acceptance, while accepted EQ/FAC refinements are included.</w:t>
       </w:r>
     </w:p>
     <w:tbl>
@@ -4141,12 +4250,8 @@
             <w:tcW w:type="dxa" w:w="4986"/>
           </w:tcPr>
           <w:p>
-            <w:r/>
-            <w:r>
-              <w:rPr>
-                <w:sz w:val="19"/>
-              </w:rPr>
-              <w:t>Planned when the prompt pack is updated</w:t>
+            <w:r>
+              <w:t>U1 follows R02B; U2 follows P11. Remove the temporary wrapper, retain accepted EQ/FAC refinements and verify the cleaned app before U1 approval</w:t>
             </w:r>
           </w:p>
         </w:tc>
@@ -4159,7 +4264,7 @@
       </w:pPr>
       <w:r>
         <w:rPr>
-          <w:color w:val="1F3A5F"/>
+          <w:color w:val="000000"/>
         </w:rPr>
         <w:t>9 Decisions</w:t>
       </w:r>
@@ -4170,7 +4275,7 @@
       </w:pPr>
       <w:r>
         <w:rPr>
-          <w:color w:val="1F3A5F"/>
+          <w:color w:val="000000"/>
         </w:rPr>
         <w:t>9.1 Confirmed by you (22 October 2026)</w:t>
       </w:r>
@@ -4603,12 +4708,8 @@
             <w:tcW w:type="dxa" w:w="3324"/>
           </w:tcPr>
           <w:p>
-            <w:r/>
-            <w:r>
-              <w:rPr>
-                <w:sz w:val="19"/>
-              </w:rPr>
-              <w:t>Not decided now; this revision only updates the SOW</w:t>
+            <w:r>
+              <w:t>Originally deferred; pack 2.0 places U1 after R02B. Revision 5 requires removal of the temporary management walkthrough before approval</w:t>
             </w:r>
           </w:p>
         </w:tc>
@@ -4621,7 +4722,7 @@
       </w:pPr>
       <w:r>
         <w:rPr>
-          <w:color w:val="1F3A5F"/>
+          <w:color w:val="000000"/>
         </w:rPr>
         <w:t>9.2 Confirmed by you (22 October 2026, revision 3)</w:t>
       </w:r>
@@ -4977,7 +5078,7 @@
       </w:pPr>
       <w:r>
         <w:rPr>
-          <w:color w:val="1F3A5F"/>
+          <w:color w:val="000000"/>
         </w:rPr>
         <w:t>9.3 ZMMS ownership and access (revision 4)</w:t>
       </w:r>
@@ -5000,11 +5101,41 @@
     </w:p>
     <w:p>
       <w:pPr>
+        <w:pStyle w:val="Heading2"/>
+      </w:pPr>
+      <w:r>
+        <w:rPr>
+          <w:color w:val="000000"/>
+        </w:rPr>
+        <w:t>9.4 Temporary walkthrough requested by you (24 October 2026, revision 5)</w:t>
+      </w:r>
+    </w:p>
+    <w:p>
+      <w:pPr/>
+      <w:r>
+        <w:t>Show the existing Portal login design at port 5312, accept blank or arbitrary credentials, show the three existing app cards plus EQ &amp; FAC Maintenance, and open the current EQ/FAC default screen from the new card. Portal features and connections to the other apps are outside this temporary task. Remove the full temporary layer before approving U1. Revision 6 clarifies that accepted EQ/FAC refinements remain in the U1 app; login/Portal feedback is deferred to actual integration (section 2A).</w:t>
+      </w:r>
+    </w:p>
+    <w:p>
+      <w:pPr>
+        <w:pStyle w:val="Heading2"/>
+      </w:pPr>
+      <w:r>
+        <w:t>9.5 Management feedback clarified by you (24 October 2026, revision 6)</w:t>
+      </w:r>
+    </w:p>
+    <w:p>
+      <w:r>
+        <w:t>EQ/FAC feedback is handled as U1 change requests and retained when accepted. Login-screen and Portal feedback is handled separately during actual Portal integration in future phases. Removing the temporary wrapper must not undo accepted EQ/FAC changes.</w:t>
+      </w:r>
+    </w:p>
+    <w:p>
+      <w:pPr>
         <w:pStyle w:val="Heading1"/>
       </w:pPr>
       <w:r>
         <w:rPr>
-          <w:color w:val="1F3A5F"/>
+          <w:color w:val="000000"/>
         </w:rPr>
         <w:t>Appendix A - supplied FAC list (documents/Facility- Dashboard.xlsx)</w:t>
       </w:r>
@@ -6186,7 +6317,7 @@
       </w:pPr>
       <w:r>
         <w:rPr>
-          <w:color w:val="1F3A5F"/>
+          <w:color w:val="000000"/>
         </w:rPr>
         <w:t>Appendix B - FAC job list as it will be imported</w:t>
       </w:r>
@@ -21548,7 +21679,7 @@
       <w:rFonts w:asciiTheme="majorHAnsi" w:eastAsiaTheme="majorEastAsia" w:hAnsiTheme="majorHAnsi" w:cstheme="majorBidi"/>
       <w:b/>
       <w:bCs/>
-      <w:color w:val="365F91" w:themeColor="accent1" w:themeShade="BF"/>
+      <w:color w:val="000000"/>
       <w:sz w:val="28"/>
       <w:szCs w:val="28"/>
     </w:rPr>
@@ -21572,7 +21703,7 @@
       <w:rFonts w:asciiTheme="majorHAnsi" w:eastAsiaTheme="majorEastAsia" w:hAnsiTheme="majorHAnsi" w:cstheme="majorBidi"/>
       <w:b/>
       <w:bCs/>
-      <w:color w:val="4F81BD" w:themeColor="accent1"/>
+      <w:color w:val="000000"/>
       <w:sz w:val="26"/>
       <w:szCs w:val="26"/>
     </w:rPr>
@@ -21596,7 +21727,7 @@
       <w:rFonts w:asciiTheme="majorHAnsi" w:eastAsiaTheme="majorEastAsia" w:hAnsiTheme="majorHAnsi" w:cstheme="majorBidi"/>
       <w:b/>
       <w:bCs/>
-      <w:color w:val="4F81BD" w:themeColor="accent1"/>
+      <w:color w:val="000000"/>
     </w:rPr>
   </w:style>
   <w:style w:type="paragraph" w:styleId="Heading4">
@@ -21621,7 +21752,7 @@
       <w:bCs/>
       <w:i/>
       <w:iCs/>
-      <w:color w:val="4F81BD" w:themeColor="accent1"/>
+      <w:color w:val="000000"/>
     </w:rPr>
   </w:style>
   <w:style w:type="paragraph" w:styleId="Heading5">
@@ -21642,7 +21773,7 @@
     </w:pPr>
     <w:rPr>
       <w:rFonts w:asciiTheme="majorHAnsi" w:eastAsiaTheme="majorEastAsia" w:hAnsiTheme="majorHAnsi" w:cstheme="majorBidi"/>
-      <w:color w:val="243F60" w:themeColor="accent1" w:themeShade="7F"/>
+      <w:color w:val="000000"/>
     </w:rPr>
   </w:style>
   <w:style w:type="paragraph" w:styleId="Heading6">
@@ -21665,7 +21796,7 @@
       <w:rFonts w:asciiTheme="majorHAnsi" w:eastAsiaTheme="majorEastAsia" w:hAnsiTheme="majorHAnsi" w:cstheme="majorBidi"/>
       <w:i/>
       <w:iCs/>
-      <w:color w:val="243F60" w:themeColor="accent1" w:themeShade="7F"/>
+      <w:color w:val="000000"/>
     </w:rPr>
   </w:style>
   <w:style w:type="paragraph" w:styleId="Heading7">
@@ -21688,7 +21819,7 @@
       <w:rFonts w:asciiTheme="majorHAnsi" w:eastAsiaTheme="majorEastAsia" w:hAnsiTheme="majorHAnsi" w:cstheme="majorBidi"/>
       <w:i/>
       <w:iCs/>
-      <w:color w:val="404040" w:themeColor="text1" w:themeTint="BF"/>
+      <w:color w:val="000000"/>
     </w:rPr>
   </w:style>
   <w:style w:type="paragraph" w:styleId="Heading8">
@@ -21709,7 +21840,7 @@
     </w:pPr>
     <w:rPr>
       <w:rFonts w:asciiTheme="majorHAnsi" w:eastAsiaTheme="majorEastAsia" w:hAnsiTheme="majorHAnsi" w:cstheme="majorBidi"/>
-      <w:color w:val="4F81BD" w:themeColor="accent1"/>
+      <w:color w:val="000000"/>
       <w:sz w:val="20"/>
       <w:szCs w:val="20"/>
     </w:rPr>
@@ -21734,7 +21865,7 @@
       <w:rFonts w:asciiTheme="majorHAnsi" w:eastAsiaTheme="majorEastAsia" w:hAnsiTheme="majorHAnsi" w:cstheme="majorBidi"/>
       <w:i/>
       <w:iCs/>
-      <w:color w:val="404040" w:themeColor="text1" w:themeTint="BF"/>
+      <w:color w:val="000000"/>
       <w:sz w:val="20"/>
       <w:szCs w:val="20"/>
     </w:rPr>
@@ -21785,7 +21916,7 @@
       <w:rFonts w:asciiTheme="majorHAnsi" w:eastAsiaTheme="majorEastAsia" w:hAnsiTheme="majorHAnsi" w:cstheme="majorBidi"/>
       <w:b/>
       <w:bCs/>
-      <w:color w:val="365F91" w:themeColor="accent1" w:themeShade="BF"/>
+      <w:color w:val="000000"/>
       <w:sz w:val="28"/>
       <w:szCs w:val="28"/>
     </w:rPr>
@@ -21800,7 +21931,7 @@
       <w:rFonts w:asciiTheme="majorHAnsi" w:eastAsiaTheme="majorEastAsia" w:hAnsiTheme="majorHAnsi" w:cstheme="majorBidi"/>
       <w:b/>
       <w:bCs/>
-      <w:color w:val="4F81BD" w:themeColor="accent1"/>
+      <w:color w:val="000000"/>
       <w:sz w:val="26"/>
       <w:szCs w:val="26"/>
     </w:rPr>
@@ -21815,7 +21946,7 @@
       <w:rFonts w:asciiTheme="majorHAnsi" w:eastAsiaTheme="majorEastAsia" w:hAnsiTheme="majorHAnsi" w:cstheme="majorBidi"/>
       <w:b/>
       <w:bCs/>
-      <w:color w:val="4F81BD" w:themeColor="accent1"/>
+      <w:color w:val="000000"/>
     </w:rPr>
   </w:style>
   <w:style w:type="paragraph" w:styleId="Title">
@@ -21827,15 +21958,12 @@
     <w:qFormat/>
     <w:rsid w:val="00FC693F"/>
     <w:pPr>
-      <w:pBdr>
-        <w:bottom w:val="single" w:sz="8" w:space="4" w:color="4F81BD" w:themeColor="accent1"/>
-      </w:pBdr>
       <w:spacing w:after="300" w:line="240" w:lineRule="auto"/>
       <w:contextualSpacing/>
     </w:pPr>
     <w:rPr>
       <w:rFonts w:asciiTheme="majorHAnsi" w:eastAsiaTheme="majorEastAsia" w:hAnsiTheme="majorHAnsi" w:cstheme="majorBidi"/>
-      <w:color w:val="17365D" w:themeColor="text2" w:themeShade="BF"/>
+      <w:color w:val="000000"/>
       <w:spacing w:val="5"/>
       <w:kern w:val="28"/>
       <w:sz w:val="52"/>
@@ -21874,7 +22002,7 @@
       <w:rFonts w:asciiTheme="majorHAnsi" w:eastAsiaTheme="majorEastAsia" w:hAnsiTheme="majorHAnsi" w:cstheme="majorBidi"/>
       <w:i/>
       <w:iCs/>
-      <w:color w:val="4F81BD" w:themeColor="accent1"/>
+      <w:color w:val="000000"/>
       <w:spacing w:val="15"/>
       <w:sz w:val="24"/>
       <w:szCs w:val="24"/>
@@ -22190,7 +22318,7 @@
       <w:bCs/>
       <w:i/>
       <w:iCs/>
-      <w:color w:val="4F81BD" w:themeColor="accent1"/>
+      <w:color w:val="000000"/>
     </w:rPr>
   </w:style>
   <w:style w:type="character" w:customStyle="1" w:styleId="Heading5Char">
@@ -22202,7 +22330,7 @@
     <w:rsid w:val="00FC693F"/>
     <w:rPr>
       <w:rFonts w:asciiTheme="majorHAnsi" w:eastAsiaTheme="majorEastAsia" w:hAnsiTheme="majorHAnsi" w:cstheme="majorBidi"/>
-      <w:color w:val="243F60" w:themeColor="accent1" w:themeShade="7F"/>
+      <w:color w:val="000000"/>
     </w:rPr>
   </w:style>
   <w:style w:type="character" w:customStyle="1" w:styleId="Heading6Char">
@@ -22216,7 +22344,7 @@
       <w:rFonts w:asciiTheme="majorHAnsi" w:eastAsiaTheme="majorEastAsia" w:hAnsiTheme="majorHAnsi" w:cstheme="majorBidi"/>
       <w:i/>
       <w:iCs/>
-      <w:color w:val="243F60" w:themeColor="accent1" w:themeShade="7F"/>
+      <w:color w:val="000000"/>
     </w:rPr>
   </w:style>
   <w:style w:type="character" w:customStyle="1" w:styleId="Heading7Char">
@@ -22230,7 +22358,7 @@
       <w:rFonts w:asciiTheme="majorHAnsi" w:eastAsiaTheme="majorEastAsia" w:hAnsiTheme="majorHAnsi" w:cstheme="majorBidi"/>
       <w:i/>
       <w:iCs/>
-      <w:color w:val="404040" w:themeColor="text1" w:themeTint="BF"/>
+      <w:color w:val="000000"/>
     </w:rPr>
   </w:style>
   <w:style w:type="character" w:customStyle="1" w:styleId="Heading8Char">
@@ -22242,7 +22370,7 @@
     <w:rsid w:val="00FC693F"/>
     <w:rPr>
       <w:rFonts w:asciiTheme="majorHAnsi" w:eastAsiaTheme="majorEastAsia" w:hAnsiTheme="majorHAnsi" w:cstheme="majorBidi"/>
-      <w:color w:val="4F81BD" w:themeColor="accent1"/>
+      <w:color w:val="000000"/>
       <w:sz w:val="20"/>
       <w:szCs w:val="20"/>
     </w:rPr>
@@ -22258,7 +22386,7 @@
       <w:rFonts w:asciiTheme="majorHAnsi" w:eastAsiaTheme="majorEastAsia" w:hAnsiTheme="majorHAnsi" w:cstheme="majorBidi"/>
       <w:i/>
       <w:iCs/>
-      <w:color w:val="404040" w:themeColor="text1" w:themeTint="BF"/>
+      <w:color w:val="000000"/>
       <w:sz w:val="20"/>
       <w:szCs w:val="20"/>
     </w:rPr>

</xml_diff>

<commit_message>
Normalize CMMS branding and equipment codes
</commit_message>
<xml_diff>
--- a/docs/SOW_V2.docx
+++ b/docs/SOW_V2.docx
@@ -20,12 +20,17 @@
     </w:p>
     <w:p>
       <w:r>
+        <w:t>25 October 2026 naming: CMMS at zmms.lk; equipment codes QC01-QC14, RTG01-RTG46 and ES01-ES07. Stable record IDs are unchanged; operating, model and work data in the prototype remain synthetic.</w:t>
+      </w:r>
+    </w:p>
+    <w:p>
+      <w:r>
         <w:t>Supersedes SOW V1 (documents/SOW.docx) only on the points below. Revision 4 was confirmed on 22 October 2026 and translated into prompt pack 2.0. The committed U1 refinements through U1-C58 remain the app baseline. Revision 5 adds the temporary management walkthrough in section 2A. Revision 6 clarifies that accepted EQ/FAC management feedback remains in the U1 app while login/Portal feedback is deferred to P05; prompt pack 2.2 reflects this. U1 remains unapproved.</w:t>
       </w:r>
     </w:p>
     <w:p>
       <w:r>
-        <w:t>Revision 2 records your answers to Q1-Q8 (section 9) and adds the EQ Jobs tab changes: special jobs, daily jobs read from ZMMS, automatic EQ status and the spare-part condition register (section 4). Revision 3 records your answers to Q9-Q14: two ZMMS syncs a day, and a manual status correction that lasts for the current day only. Revision 4 records that ZMMS is a CICT-owned app, you as its owner allow the app to read it with the login, and ZMMS has no API.</w:t>
+        <w:t>Revision 2 records your answers to Q1-Q8 (section 9) and adds the EQ Jobs tab changes: special jobs, daily jobs read from CMMS, automatic EQ status and the spare-part condition register (section 4). Revision 3 records your answers to Q9-Q14: two CMMS syncs a day, and a manual status correction that lasts for the current day only. Revision 4 records that CMMS is a CICT-owned app, you as its owner allow the app to read it with the login, and CMMS has no API.</w:t>
       </w:r>
     </w:p>
     <w:p>
@@ -137,7 +142,7 @@
         <w:pStyle w:val="ListBullet"/>
       </w:pPr>
       <w:r>
-        <w:t>EQ section: the Jobs tab has three parts - special jobs (manual, bound to a mechanism or part) with the daily maintenance jobs read from ZMMS listed below them, EQ status (automatic from ZMMS, with manual correction) and the condition of major spare parts. The crane view shows the current state only; work history is kept in the Jobs tab.</w:t>
+        <w:t>EQ section: the Jobs tab has three parts - special jobs (manual, bound to a mechanism or part) with the daily maintenance jobs read from CMMS listed below them, EQ status (automatic from CMMS, with manual correction) and the condition of major spare parts. The crane view shows the current state only; work history is kept in the Jobs tab.</w:t>
       </w:r>
     </w:p>
     <w:p>
@@ -1582,7 +1587,7 @@
         <w:pStyle w:val="ListBullet"/>
       </w:pPr>
       <w:r>
-        <w:t>Fleet cards show whether the status is automatic (ZMMS) or a manual correction, and the number of today's ZMMS daily jobs.</w:t>
+        <w:t>Fleet cards show whether the status is automatic (CMMS) or a manual correction, and the number of today's CMMS daily jobs.</w:t>
       </w:r>
     </w:p>
     <w:p>
@@ -1611,7 +1616,7 @@
         <w:br/>
         <w:t xml:space="preserve">          |  ...                                                              |</w:t>
         <w:br/>
-        <w:t xml:space="preserve">          +-- Daily maintenance jobs (from ZMMS, read-only) -----------------+</w:t>
+        <w:t xml:space="preserve">          +-- Daily maintenance jobs (from CMMS, read-only) -----------------+</w:t>
         <w:br/>
         <w:t xml:space="preserve">          |  ...                                                              |</w:t>
         <w:br/>
@@ -1674,7 +1679,7 @@
         <w:rPr>
           <w:color w:val="000000"/>
         </w:rPr>
-        <w:t>4.4 Daily maintenance jobs (from ZMMS)</w:t>
+        <w:t>4.4 Daily maintenance jobs (from CMMS)</w:t>
       </w:r>
     </w:p>
     <w:p>
@@ -1682,7 +1687,7 @@
         <w:pStyle w:val="ListBullet"/>
       </w:pPr>
       <w:r>
-        <w:t xml:space="preserve">Source: the ZMMS (CMMS.LK) daily all-job list, </w:t>
+        <w:t xml:space="preserve">Source: the CMMS (zmms.lk) daily all-job list, </w:t>
       </w:r>
       <w:r>
         <w:rPr>
@@ -1699,7 +1704,7 @@
         <w:pStyle w:val="ListBullet"/>
       </w:pPr>
       <w:r>
-        <w:t>The app server reads the list automatically twice a day (defaults 06:00 and 14:00 Asia/Colombo; Admin can change both times and press "Sync now"). Reading only - the app never writes to ZMMS.</w:t>
+        <w:t>The app server reads the list automatically twice a day (defaults 06:00 and 14:00 Asia/Colombo; Admin can change both times and press "Sync now"). Reading only - the app never writes to CMMS.</w:t>
       </w:r>
     </w:p>
     <w:p>
@@ -1707,7 +1712,7 @@
         <w:pStyle w:val="ListBullet"/>
       </w:pPr>
       <w:r>
-        <w:t>Each record keeps what ZMMS gives, at least: ZMMS job number, date, equipment, job description or type and job status. The exact field list is fixed once the account is available.</w:t>
+        <w:t>Each record keeps what CMMS gives, at least: CMMS job number, date, equipment, job description or type and job status. The exact field list is fixed once the account is available.</w:t>
       </w:r>
     </w:p>
     <w:p>
@@ -1715,7 +1720,7 @@
         <w:pStyle w:val="ListBullet"/>
       </w:pPr>
       <w:r>
-        <w:t>ZMMS equipment names or codes are matched to app equipment through a mapping table in Admin. Rows that do not match are listed in Admin for mapping and are not lost.</w:t>
+        <w:t>CMMS equipment names or codes are matched to app equipment through a mapping table in Admin. Rows that do not match are listed in Admin for mapping and are not lost.</w:t>
       </w:r>
     </w:p>
     <w:p>
@@ -1731,7 +1736,7 @@
         <w:pStyle w:val="ListBullet"/>
       </w:pPr>
       <w:r>
-        <w:t>Sync health: Admin sees the last sync time, rows read and any failure; users see "ZMMS data from dd Mon hh:mm". A failed sync keeps the previous data, retries, and warns Admin.</w:t>
+        <w:t>Sync health: Admin sees the last sync time, rows read and any failure; users see "CMMS data from dd Mon hh:mm". A failed sync keeps the previous data, retries, and warns Admin.</w:t>
       </w:r>
     </w:p>
     <w:p>
@@ -1739,7 +1744,7 @@
         <w:pStyle w:val="ListBullet"/>
       </w:pPr>
       <w:r>
-        <w:t>The ZMMS account is kept in the server configuration, never in code, logs or the browser.</w:t>
+        <w:t>The CMMS account is kept in the server configuration, never in code, logs or the browser.</w:t>
       </w:r>
     </w:p>
     <w:p>
@@ -1747,7 +1752,7 @@
         <w:pStyle w:val="ListBullet"/>
       </w:pPr>
       <w:r>
-        <w:t>Method: ZMMS is a CICT-owned app with no API. As its owner you have agreed that this app signs in with the account and reads the daily job page. If the ZMMS page layout changes, the sync reports a failure to Admin instead of saving wrong data.</w:t>
+        <w:t>Method: CMMS is a CICT-owned app with no API. As its owner you have agreed that this app signs in with the account and reads the daily job page. If the CMMS page layout changes, the sync reports a failure to Admin instead of saving wrong data.</w:t>
       </w:r>
     </w:p>
     <w:p>
@@ -1766,7 +1771,7 @@
         <w:pStyle w:val="ListBullet"/>
       </w:pPr>
       <w:r>
-        <w:t>After each sync the app sets each mapped equipment's status from the day's ZMMS plan: a breakdown job -&gt; Breakdown; a maintenance job -&gt; Maintenance; equipment not in the day's plan -&gt; Ready for OPS (in operations). Which ZMMS job types and statuses mean Breakdown or Maintenance is set in Admin after the first real ZMMS data (Q11).</w:t>
+        <w:t>After each sync the app sets each mapped equipment's status from the day's CMMS plan: a breakdown job -&gt; Breakdown; a maintenance job -&gt; Maintenance; equipment not in the day's plan -&gt; Ready for OPS (in operations). Which CMMS job types and statuses mean Breakdown or Maintenance is set in Admin after the first real CMMS data (Q11).</w:t>
       </w:r>
     </w:p>
     <w:p>
@@ -1782,7 +1787,7 @@
         <w:pStyle w:val="ListBullet"/>
       </w:pPr>
       <w:r>
-        <w:t>Equipment with no ZMMS mapping keeps the V1 manual status.</w:t>
+        <w:t>Equipment with no CMMS mapping keeps the V1 manual status.</w:t>
       </w:r>
     </w:p>
     <w:p>
@@ -1790,7 +1795,7 @@
         <w:pStyle w:val="ListBullet"/>
       </w:pPr>
       <w:r>
-        <w:t>The EQ status part of the Jobs tab lists every status change with its source (ZMMS sync or user), time and reason.</w:t>
+        <w:t>The EQ status part of the Jobs tab lists every status change with its source (CMMS sync or user), time and reason.</w:t>
       </w:r>
     </w:p>
     <w:p>
@@ -1944,7 +1949,7 @@
               <w:rPr>
                 <w:sz w:val="19"/>
               </w:rPr>
-              <w:t>Automatic from ZMMS daily jobs, with manual correction</w:t>
+              <w:t>Automatic from CMMS daily jobs, with manual correction</w:t>
             </w:r>
           </w:p>
         </w:tc>
@@ -1974,7 +1979,7 @@
               <w:rPr>
                 <w:sz w:val="19"/>
               </w:rPr>
-              <w:t>Still no Maximo/EAM link; ZMMS daily jobs are read (read-only)</w:t>
+              <w:t>Still no Maximo/EAM link; CMMS daily jobs are read (read-only)</w:t>
             </w:r>
           </w:p>
         </w:tc>
@@ -2034,7 +2039,7 @@
               <w:rPr>
                 <w:sz w:val="19"/>
               </w:rPr>
-              <w:t>Special jobs keep those statuses; daily jobs come from ZMMS</w:t>
+              <w:t>Special jobs keep those statuses; daily jobs come from CMMS</w:t>
             </w:r>
           </w:p>
         </w:tc>
@@ -3815,7 +3820,7 @@
         <w:pStyle w:val="ListBullet"/>
       </w:pPr>
       <w:r>
-        <w:t>Own SQL Server database; no Maximo/EAM link. The only external system the app reads is ZMMS (4.4).</w:t>
+        <w:t>Own SQL Server database; no Maximo/EAM link. The only external system the app reads is CMMS (4.4).</w:t>
       </w:r>
     </w:p>
     <w:p>
@@ -3842,7 +3847,7 @@
         <w:pStyle w:val="ListBullet"/>
       </w:pPr>
       <w:r>
-        <w:t>EQ: writing anything back to ZMMS; reading ZMMS jobs other than the daily job list; linking ZMMS daily jobs to mechanisms or parts; predictions from running hours, sensors or AI; spare-part stock and purchasing. Other V1 exclusions unchanged.</w:t>
+        <w:t>EQ: writing anything back to CMMS; reading CMMS jobs other than the daily job list; linking CMMS daily jobs to mechanisms or parts; predictions from running hours, sensors or AI; spare-part stock and purchasing. Other V1 exclusions unchanged.</w:t>
       </w:r>
     </w:p>
     <w:p>
@@ -3942,7 +3947,7 @@
               <w:rPr>
                 <w:sz w:val="19"/>
               </w:rPr>
-              <w:t>Version 2.0: FAC scope items, FAC Team role, feature-permission matrix, EQ changes of section 4A, ZMMS read-only import, FAC exclusions</w:t>
+              <w:t>Version 2.0: FAC scope items, FAC Team role, feature-permission matrix, EQ changes of section 4A, CMMS read-only import, FAC exclusions</w:t>
             </w:r>
           </w:p>
         </w:tc>
@@ -3972,7 +3977,7 @@
               <w:rPr>
                 <w:sz w:val="19"/>
               </w:rPr>
-              <w:t>Addendum: FAC tables (jobs, cycles, updates, photos), FAC API, permission matrix, ZMMS daily jobs, status source, spare-part register</w:t>
+              <w:t>Addendum: FAC tables (jobs, cycles, updates, photos), FAC API, permission matrix, CMMS daily jobs, status source, spare-part register</w:t>
             </w:r>
           </w:p>
         </w:tc>
@@ -4075,7 +4080,7 @@
               <w:rPr>
                 <w:sz w:val="19"/>
               </w:rPr>
-              <w:t>Access matrix, FAC master list and Excel import, ZMMS equipment mapping and status rules, major spare-part selection and expected life</w:t>
+              <w:t>Access matrix, FAC master list and Excel import, CMMS equipment mapping and status rules, major spare-part selection and expected life</w:t>
             </w:r>
           </w:p>
         </w:tc>
@@ -4121,7 +4126,7 @@
               <w:rPr>
                 <w:sz w:val="19"/>
               </w:rPr>
-              <w:t>New ZMMS phase</w:t>
+              <w:t>New CMMS phase</w:t>
             </w:r>
           </w:p>
         </w:tc>
@@ -4225,7 +4230,7 @@
               <w:rPr>
                 <w:sz w:val="19"/>
               </w:rPr>
-              <w:t>FAC and ZMMS acceptance cases; reviews cover both</w:t>
+              <w:t>FAC and CMMS acceptance cases; reviews cover both</w:t>
             </w:r>
           </w:p>
         </w:tc>
@@ -4831,7 +4836,7 @@
               <w:rPr>
                 <w:sz w:val="19"/>
               </w:rPr>
-              <w:t>ZMMS access</w:t>
+              <w:t>CMMS access</w:t>
             </w:r>
           </w:p>
         </w:tc>
@@ -4875,7 +4880,7 @@
               <w:rPr>
                 <w:sz w:val="19"/>
               </w:rPr>
-              <w:t>ZMMS sync timing</w:t>
+              <w:t>CMMS sync timing</w:t>
             </w:r>
           </w:p>
         </w:tc>
@@ -4919,7 +4924,7 @@
               <w:rPr>
                 <w:sz w:val="19"/>
               </w:rPr>
-              <w:t>Which ZMMS jobs mean Breakdown or Maintenance</w:t>
+              <w:t>Which CMMS jobs mean Breakdown or Maintenance</w:t>
             </w:r>
           </w:p>
         </w:tc>
@@ -4933,7 +4938,7 @@
               <w:rPr>
                 <w:sz w:val="19"/>
               </w:rPr>
-              <w:t>Set in Admin after the first real ZMMS data</w:t>
+              <w:t>Set in Admin after the first real CMMS data</w:t>
             </w:r>
           </w:p>
         </w:tc>
@@ -4977,7 +4982,7 @@
               <w:rPr>
                 <w:sz w:val="19"/>
               </w:rPr>
-              <w:t>The current day only; next day the ZMMS plan decides, and equipment not in the plan is Ready for OPS</w:t>
+              <w:t>The current day only; next day the CMMS plan decides, and equipment not in the plan is Ready for OPS</w:t>
             </w:r>
           </w:p>
         </w:tc>
@@ -5080,7 +5085,7 @@
         <w:rPr>
           <w:color w:val="000000"/>
         </w:rPr>
-        <w:t>9.3 ZMMS ownership and access (revision 4)</w:t>
+        <w:t>9.3 CMMS ownership and access (revision 4)</w:t>
       </w:r>
     </w:p>
     <w:p>
@@ -5088,7 +5093,7 @@
         <w:pStyle w:val="ListBullet"/>
       </w:pPr>
       <w:r>
-        <w:t>ZMMS is a CICT-owned app; you are its owner and have agreed to this app reading it with the login.</w:t>
+        <w:t>CMMS is a CICT-owned app; you are its owner and have agreed to this app reading it with the login.</w:t>
       </w:r>
     </w:p>
     <w:p>
@@ -5096,7 +5101,7 @@
         <w:pStyle w:val="ListBullet"/>
       </w:pPr>
       <w:r>
-        <w:t>ZMMS has no API or export, so the app signs in and reads the daily job page (4.4).</w:t>
+        <w:t>CMMS has no API or export, so the app signs in and reads the daily job page (4.4).</w:t>
       </w:r>
     </w:p>
     <w:p>

</xml_diff>